<commit_message>
Update college docs with team members (Abhinav, Amit, Anand, Abhishek) and coordinator Ms. Mona Nagar
</commit_message>
<xml_diff>
--- a/docs/Project_Report.docx
+++ b/docs/Project_Report.docx
@@ -4,6 +4,7 @@
   <w:body>
     <w:p>
       <w:pPr>
+        <w:spacing w:after="40"/>
         <w:jc w:val="center"/>
       </w:pPr>
       <w:r>
@@ -12,7 +13,7 @@
           <w:b/>
           <w:i w:val="0"/>
           <w:color w:val="000000"/>
-          <w:sz w:val="32"/>
+          <w:sz w:val="30"/>
         </w:rPr>
         <w:t>A</w:t>
         <w:br/>
@@ -23,7 +24,7 @@
           <w:b/>
           <w:i w:val="0"/>
           <w:color w:val="000000"/>
-          <w:sz w:val="36"/>
+          <w:sz w:val="34"/>
         </w:rPr>
         <w:t>Project Report</w:t>
         <w:br/>
@@ -36,7 +37,7 @@
           <w:b/>
           <w:i w:val="0"/>
           <w:color w:val="0A285F"/>
-          <w:sz w:val="32"/>
+          <w:sz w:val="30"/>
         </w:rPr>
         <w:t>MULTI-THREADED CLIENT-SERVER CHAT APPLICATION USING JAVA SOCKETS, SWING, AND MYSQL</w:t>
         <w:br/>
@@ -48,7 +49,7 @@
           <w:b w:val="0"/>
           <w:i/>
           <w:color w:val="000000"/>
-          <w:sz w:val="24"/>
+          <w:sz w:val="23"/>
         </w:rPr>
         <w:t>Submitted in partial fulfillment for the award of degree of</w:t>
         <w:br/>
@@ -59,7 +60,7 @@
           <w:b/>
           <w:i w:val="0"/>
           <w:color w:val="000000"/>
-          <w:sz w:val="28"/>
+          <w:sz w:val="27"/>
         </w:rPr>
         <w:t>Bachelor of Technology</w:t>
         <w:br/>
@@ -70,7 +71,7 @@
           <w:b w:val="0"/>
           <w:i/>
           <w:color w:val="000000"/>
-          <w:sz w:val="24"/>
+          <w:sz w:val="23"/>
         </w:rPr>
         <w:t>Degree Of</w:t>
         <w:br/>
@@ -81,7 +82,7 @@
           <w:b/>
           <w:i w:val="0"/>
           <w:color w:val="000000"/>
-          <w:sz w:val="28"/>
+          <w:sz w:val="27"/>
         </w:rPr>
         <w:t>Rajasthan Technical University, KOTA</w:t>
         <w:br/>
@@ -93,7 +94,7 @@
           <w:b/>
           <w:i w:val="0"/>
           <w:color w:val="0A285F"/>
-          <w:sz w:val="28"/>
+          <w:sz w:val="27"/>
         </w:rPr>
         <w:t>JAIPUR ENGINEERING COLLEGE AND RESEARCH CENTRE</w:t>
         <w:br/>
@@ -104,7 +105,7 @@
           <w:b/>
           <w:i w:val="0"/>
           <w:color w:val="000000"/>
-          <w:sz w:val="26"/>
+          <w:sz w:val="25"/>
         </w:rPr>
         <w:t>2026-2027</w:t>
         <w:br/>
@@ -119,13 +120,13 @@
         <w:tblLook w:firstColumn="1" w:firstRow="1" w:lastColumn="0" w:lastRow="0" w:noHBand="0" w:noVBand="1" w:val="04A0"/>
       </w:tblPr>
       <w:tblGrid>
-        <w:gridCol w:w="4680"/>
-        <w:gridCol w:w="4680"/>
+        <w:gridCol w:w="4824"/>
+        <w:gridCol w:w="4824"/>
       </w:tblGrid>
       <w:tr>
         <w:tc>
           <w:tcPr>
-            <w:tcW w:type="dxa" w:w="4608"/>
+            <w:tcW w:type="dxa" w:w="4752"/>
           </w:tcPr>
           <w:p>
             <w:pPr>
@@ -137,7 +138,7 @@
                 <w:b/>
                 <w:i w:val="0"/>
                 <w:color w:val="000000"/>
-                <w:sz w:val="24"/>
+                <w:sz w:val="23"/>
               </w:rPr>
               <w:t>Submitted By:</w:t>
               <w:br/>
@@ -150,17 +151,19 @@
                 <w:color w:val="000000"/>
                 <w:sz w:val="22"/>
               </w:rPr>
-              <w:t>Anand Gaur (Roll No: &lt;Roll No.&gt;)</w:t>
+              <w:t>Abhinav Batra (24EJCCA009)</w:t>
               <w:br/>
-              <w:t>Sunanda (Roll No: &lt;Roll No.&gt;)</w:t>
+              <w:t>Amit Kumar (24EJCCA027)</w:t>
               <w:br/>
-              <w:t>&lt;Team Member 3&gt; (Roll No: &lt;Roll No.&gt;)</w:t>
+              <w:t>Anand Gaur (24EJCCA030)</w:t>
+              <w:br/>
+              <w:t>Abhishek Sihag (24EJCCA012)</w:t>
             </w:r>
           </w:p>
         </w:tc>
         <w:tc>
           <w:tcPr>
-            <w:tcW w:type="dxa" w:w="4608"/>
+            <w:tcW w:type="dxa" w:w="4464"/>
           </w:tcPr>
           <w:p>
             <w:pPr>
@@ -172,9 +175,9 @@
                 <w:b/>
                 <w:i w:val="0"/>
                 <w:color w:val="000000"/>
-                <w:sz w:val="24"/>
+                <w:sz w:val="23"/>
               </w:rPr>
-              <w:t>ITS Coordinator (CC)</w:t>
+              <w:t>ITS Coordinator (CC):</w:t>
               <w:br/>
             </w:r>
             <w:r>
@@ -185,9 +188,9 @@
                 <w:color w:val="000000"/>
                 <w:sz w:val="22"/>
               </w:rPr>
-              <w:t>&lt;Faculty Name&gt;</w:t>
+              <w:t>Ms. Mona Nagar</w:t>
               <w:br/>
-              <w:t>&lt;Designation&gt;</w:t>
+              <w:t>Assistant Professor</w:t>
               <w:br/>
               <w:t>Dept. of CSE (AI)</w:t>
             </w:r>
@@ -206,7 +209,7 @@
           <w:b/>
           <w:i w:val="0"/>
           <w:color w:val="0A285F"/>
-          <w:sz w:val="24"/>
+          <w:sz w:val="23"/>
         </w:rPr>
         <w:t>DEPARTMENT OF</w:t>
         <w:br/>
@@ -219,7 +222,7 @@
           <w:b/>
           <w:i w:val="0"/>
           <w:color w:val="000000"/>
-          <w:sz w:val="24"/>
+          <w:sz w:val="23"/>
         </w:rPr>
         <w:t>JAIPUR ENGINEERING COLLEGE AND RESEARCH CENTRE</w:t>
         <w:br/>
@@ -230,7 +233,7 @@
           <w:b w:val="0"/>
           <w:i/>
           <w:color w:val="000000"/>
-          <w:sz w:val="20"/>
+          <w:sz w:val="19"/>
         </w:rPr>
         <w:t>Shri Ram ki Nangal, via Sitapura RIICO, Tonk Road, Sukhpuria, Bambala, Jaipur, Rajasthan</w:t>
       </w:r>
@@ -264,8 +267,8 @@
         <w:tblLook w:firstColumn="1" w:firstRow="1" w:lastColumn="0" w:lastRow="0" w:noHBand="0" w:noVBand="1" w:val="04A0"/>
       </w:tblPr>
       <w:tblGrid>
-        <w:gridCol w:w="4680"/>
-        <w:gridCol w:w="4680"/>
+        <w:gridCol w:w="4824"/>
+        <w:gridCol w:w="4824"/>
       </w:tblGrid>
       <w:tr>
         <w:tc>
@@ -281,7 +284,7 @@
                 <w:color w:val="000000"/>
                 <w:sz w:val="24"/>
               </w:rPr>
-              <w:t>Introduction ................................................</w:t>
+              <w:t>Introduction ..............................................</w:t>
             </w:r>
           </w:p>
         </w:tc>
@@ -320,7 +323,7 @@
                 <w:color w:val="000000"/>
                 <w:sz w:val="24"/>
               </w:rPr>
-              <w:t>Objective ...................................................</w:t>
+              <w:t>Objective .................................................</w:t>
             </w:r>
           </w:p>
         </w:tc>
@@ -359,7 +362,7 @@
                 <w:color w:val="000000"/>
                 <w:sz w:val="24"/>
               </w:rPr>
-              <w:t>Methodology And Planning ....................................</w:t>
+              <w:t>Methodology And Planning ..................................</w:t>
             </w:r>
           </w:p>
         </w:tc>
@@ -398,7 +401,7 @@
                 <w:color w:val="000000"/>
                 <w:sz w:val="24"/>
               </w:rPr>
-              <w:t>Literature Review ...........................................</w:t>
+              <w:t>Literature Review .........................................</w:t>
             </w:r>
           </w:p>
         </w:tc>
@@ -437,7 +440,7 @@
                 <w:color w:val="000000"/>
                 <w:sz w:val="24"/>
               </w:rPr>
-              <w:t>Applications of the Project .................................</w:t>
+              <w:t>Applications of the Project ...............................</w:t>
             </w:r>
           </w:p>
         </w:tc>
@@ -476,7 +479,7 @@
                 <w:color w:val="000000"/>
                 <w:sz w:val="24"/>
               </w:rPr>
-              <w:t>Block Diagram ...............................................</w:t>
+              <w:t>Block Diagram .............................................</w:t>
             </w:r>
           </w:p>
         </w:tc>
@@ -515,7 +518,7 @@
                 <w:color w:val="000000"/>
                 <w:sz w:val="24"/>
               </w:rPr>
-              <w:t>UML Diagram .................................................</w:t>
+              <w:t>UML Diagram ...............................................</w:t>
             </w:r>
           </w:p>
         </w:tc>
@@ -554,7 +557,7 @@
                 <w:color w:val="000000"/>
                 <w:sz w:val="24"/>
               </w:rPr>
-              <w:t>Screenshots .................................................</w:t>
+              <w:t>Screenshots ...............................................</w:t>
             </w:r>
           </w:p>
         </w:tc>
@@ -593,7 +596,7 @@
                 <w:color w:val="000000"/>
                 <w:sz w:val="24"/>
               </w:rPr>
-              <w:t>References ..................................................</w:t>
+              <w:t>References ................................................</w:t>
             </w:r>
           </w:p>
         </w:tc>
@@ -632,7 +635,7 @@
                 <w:color w:val="000000"/>
                 <w:sz w:val="24"/>
               </w:rPr>
-              <w:t>Approval of the Project .....................................</w:t>
+              <w:t>Approval of the Project ...................................</w:t>
             </w:r>
           </w:p>
         </w:tc>
@@ -1209,7 +1212,7 @@
           <w:color w:val="000000"/>
           <w:sz w:val="23"/>
         </w:rPr>
-        <w:t>This is to certify that the project entitled 'MULTI-THREADED CLIENT-SERVER CHAT APPLICATION USING JAVA SOCKETS, SWING, AND MYSQL' submitted by Anand Gaur, Sunanda, and &lt;Team Member 3&gt; in partial fulfillment for the award of the degree of Bachelor of Technology in Computer Science &amp; Engineering (Artificial Intelligence) at Jaipur Engineering College and Research Centre, Jaipur, affiliated with Rajasthan Technical University, Kota, is an authentic record of bonafide work carried out by them under my guidance and supervision.</w:t>
+        <w:t>This is to certify that the project entitled 'MULTI-THREADED CLIENT-SERVER CHAT APPLICATION USING JAVA SOCKETS, SWING, AND MYSQL' submitted by Abhinav Batra (24EJCCA009), Amit Kumar (24EJCCA027), Anand Gaur (24EJCCA030), and Abhishek Sihag (24EJCCA012) in partial fulfillment for the award of the degree of Bachelor of Technology in Computer Science &amp; Engineering (Artificial Intelligence) at Jaipur Engineering College and Research Centre, Jaipur, affiliated with Rajasthan Technical University, Kota, is an authentic record of bonafide work carried out by them under my guidance and supervision.</w:t>
         <w:br/>
         <w:br/>
         <w:t>To the best of my knowledge, the matter embodied in this project report has not been submitted to any other University / Institute for the award of any degree or diploma.</w:t>
@@ -1224,8 +1227,8 @@
         <w:tblLook w:firstColumn="1" w:firstRow="1" w:lastColumn="0" w:lastRow="0" w:noHBand="0" w:noVBand="1" w:val="04A0"/>
       </w:tblPr>
       <w:tblGrid>
-        <w:gridCol w:w="4680"/>
-        <w:gridCol w:w="4680"/>
+        <w:gridCol w:w="4824"/>
+        <w:gridCol w:w="4824"/>
       </w:tblGrid>
       <w:tr>
         <w:tc>
@@ -1248,9 +1251,11 @@
               <w:br/>
               <w:t>Signature of Project Guide</w:t>
               <w:br/>
-              <w:t>&lt;Faculty Name&gt;</w:t>
+              <w:t>Ms. Mona Nagar</w:t>
               <w:br/>
-              <w:t>&lt;Designation&gt;</w:t>
+              <w:t>Assistant Professor</w:t>
+              <w:br/>
+              <w:t>Dept. of CSE (AI)</w:t>
             </w:r>
           </w:p>
         </w:tc>
@@ -1284,7 +1289,7 @@
     </w:tbl>
     <w:sectPr>
       <w:pgSz w:w="12240" w:h="15840"/>
-      <w:pgMar w:top="1440" w:right="1440" w:bottom="1440" w:left="1440" w:header="720" w:footer="720" w:gutter="0"/>
+      <w:pgMar w:top="1296" w:right="1296" w:bottom="1296" w:left="1296" w:header="720" w:footer="720" w:gutter="0"/>
       <w:cols w:space="720"/>
       <w:docGrid w:linePitch="360"/>
     </w:sectPr>

</xml_diff>

<commit_message>
Transform into JECRC StaffNet: College Staff Information & Circular System
</commit_message>
<xml_diff>
--- a/docs/Project_Report.docx
+++ b/docs/Project_Report.docx
@@ -4,110 +4,55 @@
   <w:body>
     <w:p>
       <w:pPr>
-        <w:spacing w:after="40"/>
         <w:jc w:val="center"/>
       </w:pPr>
       <w:r>
         <w:rPr>
-          <w:rFonts w:ascii="Times New Roman" w:hAnsi="Times New Roman"/>
+          <w:rFonts w:ascii="Segoe UI" w:hAnsi="Segoe UI"/>
           <w:b/>
-          <w:i w:val="0"/>
-          <w:color w:val="000000"/>
-          <w:sz w:val="30"/>
+          <w:color w:val="475569"/>
+          <w:sz w:val="24"/>
         </w:rPr>
-        <w:t>A</w:t>
+        <w:t>JAIPUR ENGINEERING COLLEGE AND RESEARCH CENTRE</w:t>
         <w:br/>
-      </w:r>
-      <w:r>
-        <w:rPr>
-          <w:rFonts w:ascii="Times New Roman" w:hAnsi="Times New Roman"/>
-          <w:b/>
-          <w:i w:val="0"/>
-          <w:color w:val="000000"/>
-          <w:sz w:val="34"/>
-        </w:rPr>
-        <w:t>Project Report</w:t>
-        <w:br/>
-        <w:t>On</w:t>
-        <w:br/>
-      </w:r>
-      <w:r>
-        <w:rPr>
-          <w:rFonts w:ascii="Times New Roman" w:hAnsi="Times New Roman"/>
-          <w:b/>
-          <w:i w:val="0"/>
-          <w:color w:val="0A285F"/>
-          <w:sz w:val="30"/>
-        </w:rPr>
-        <w:t>MULTI-THREADED CLIENT-SERVER CHAT APPLICATION USING JAVA SOCKETS, SWING, AND MYSQL</w:t>
+        <w:t>DEPARTMENT OF COMPUTER SCIENCE &amp; ENGINEERING (AI)</w:t>
         <w:br/>
         <w:br/>
       </w:r>
       <w:r>
         <w:rPr>
-          <w:rFonts w:ascii="Times New Roman" w:hAnsi="Times New Roman"/>
-          <w:b w:val="0"/>
-          <w:i/>
-          <w:color w:val="000000"/>
-          <w:sz w:val="23"/>
+          <w:rFonts w:ascii="Segoe UI" w:hAnsi="Segoe UI"/>
+          <w:b/>
+          <w:color w:val="64748B"/>
+          <w:sz w:val="28"/>
         </w:rPr>
-        <w:t>Submitted in partial fulfillment for the award of degree of</w:t>
+        <w:t>PROJECT REPORT</w:t>
+        <w:br/>
+        <w:t>ON</w:t>
         <w:br/>
       </w:r>
       <w:r>
         <w:rPr>
-          <w:rFonts w:ascii="Times New Roman" w:hAnsi="Times New Roman"/>
+          <w:rFonts w:ascii="Segoe UI" w:hAnsi="Segoe UI"/>
           <w:b/>
-          <w:i w:val="0"/>
-          <w:color w:val="000000"/>
-          <w:sz w:val="27"/>
+          <w:color w:val="1E3A8A"/>
+          <w:sz w:val="36"/>
         </w:rPr>
-        <w:t>Bachelor of Technology</w:t>
-        <w:br/>
-      </w:r>
-      <w:r>
-        <w:rPr>
-          <w:rFonts w:ascii="Times New Roman" w:hAnsi="Times New Roman"/>
-          <w:b w:val="0"/>
-          <w:i/>
-          <w:color w:val="000000"/>
-          <w:sz w:val="23"/>
-        </w:rPr>
-        <w:t>Degree Of</w:t>
-        <w:br/>
-      </w:r>
-      <w:r>
-        <w:rPr>
-          <w:rFonts w:ascii="Times New Roman" w:hAnsi="Times New Roman"/>
-          <w:b/>
-          <w:i w:val="0"/>
-          <w:color w:val="000000"/>
-          <w:sz w:val="27"/>
-        </w:rPr>
-        <w:t>Rajasthan Technical University, KOTA</w:t>
+        <w:t>JECRC StaffNet: Campus Intranet Faculty Information &amp; Official Circular Distribution System</w:t>
         <w:br/>
         <w:br/>
       </w:r>
       <w:r>
         <w:rPr>
-          <w:rFonts w:ascii="Times New Roman" w:hAnsi="Times New Roman"/>
-          <w:b/>
-          <w:i w:val="0"/>
-          <w:color w:val="0A285F"/>
-          <w:sz w:val="27"/>
+          <w:rFonts w:ascii="Segoe UI" w:hAnsi="Segoe UI"/>
+          <w:color w:val="475569"/>
+          <w:sz w:val="22"/>
         </w:rPr>
-        <w:t>JAIPUR ENGINEERING COLLEGE AND RESEARCH CENTRE</w:t>
+        <w:t>Submitted in partial fulfillment of the requirements for</w:t>
         <w:br/>
-      </w:r>
-      <w:r>
-        <w:rPr>
-          <w:rFonts w:ascii="Times New Roman" w:hAnsi="Times New Roman"/>
-          <w:b/>
-          <w:i w:val="0"/>
-          <w:color w:val="000000"/>
-          <w:sz w:val="25"/>
-        </w:rPr>
-        <w:t>2026-2027</w:t>
+        <w:t>Advanced Java Lab (B.Tech 3rd Year CSE-AI)</w:t>
+        <w:br/>
+        <w:t>Rajasthan Technical University (RTU), Kota</w:t>
         <w:br/>
         <w:br/>
       </w:r>
@@ -116,83 +61,247 @@
       <w:tblPr>
         <w:tblW w:type="auto" w:w="0"/>
         <w:jc w:val="center"/>
-        <w:tblLayout w:type="fixed"/>
         <w:tblLook w:firstColumn="1" w:firstRow="1" w:lastColumn="0" w:lastRow="0" w:noHBand="0" w:noVBand="1" w:val="04A0"/>
       </w:tblPr>
       <w:tblGrid>
-        <w:gridCol w:w="4824"/>
-        <w:gridCol w:w="4824"/>
+        <w:gridCol w:w="3216"/>
+        <w:gridCol w:w="3216"/>
+        <w:gridCol w:w="3216"/>
       </w:tblGrid>
       <w:tr>
         <w:tc>
           <w:tcPr>
-            <w:tcW w:type="dxa" w:w="4752"/>
+            <w:tcW w:type="dxa" w:w="3216"/>
+            <w:shd w:fill="1E3A8A"/>
           </w:tcPr>
           <w:p>
-            <w:pPr>
-              <w:jc w:val="left"/>
-            </w:pPr>
             <w:r>
               <w:rPr>
-                <w:rFonts w:ascii="Times New Roman" w:hAnsi="Times New Roman"/>
+                <w:rFonts w:ascii="Segoe UI" w:hAnsi="Segoe UI"/>
                 <w:b/>
-                <w:i w:val="0"/>
-                <w:color w:val="000000"/>
-                <w:sz w:val="23"/>
+                <w:color w:val="FFFFFF"/>
               </w:rPr>
-              <w:t>Submitted By:</w:t>
-              <w:br/>
-            </w:r>
-            <w:r>
-              <w:rPr>
-                <w:rFonts w:ascii="Times New Roman" w:hAnsi="Times New Roman"/>
-                <w:b w:val="0"/>
-                <w:i w:val="0"/>
-                <w:color w:val="000000"/>
-                <w:sz w:val="22"/>
-              </w:rPr>
-              <w:t>Abhinav Batra (24EJCCA009)</w:t>
-              <w:br/>
-              <w:t>Amit Kumar (24EJCCA027)</w:t>
-              <w:br/>
-              <w:t>Anand Gaur (24EJCCA030)</w:t>
-              <w:br/>
-              <w:t>Abhishek Sihag (24EJCCA012)</w:t>
+              <w:t>Roll Number</w:t>
             </w:r>
           </w:p>
         </w:tc>
         <w:tc>
           <w:tcPr>
-            <w:tcW w:type="dxa" w:w="4464"/>
+            <w:tcW w:type="dxa" w:w="3216"/>
+            <w:shd w:fill="1E3A8A"/>
           </w:tcPr>
           <w:p>
-            <w:pPr>
-              <w:jc w:val="right"/>
-            </w:pPr>
             <w:r>
               <w:rPr>
-                <w:rFonts w:ascii="Times New Roman" w:hAnsi="Times New Roman"/>
+                <w:rFonts w:ascii="Segoe UI" w:hAnsi="Segoe UI"/>
                 <w:b/>
-                <w:i w:val="0"/>
-                <w:color w:val="000000"/>
-                <w:sz w:val="23"/>
+                <w:color w:val="FFFFFF"/>
               </w:rPr>
-              <w:t>ITS Coordinator (CC):</w:t>
-              <w:br/>
+              <w:t>Submitted By</w:t>
             </w:r>
+          </w:p>
+        </w:tc>
+        <w:tc>
+          <w:tcPr>
+            <w:tcW w:type="dxa" w:w="3216"/>
+            <w:shd w:fill="1E3A8A"/>
+          </w:tcPr>
+          <w:p>
             <w:r>
               <w:rPr>
-                <w:rFonts w:ascii="Times New Roman" w:hAnsi="Times New Roman"/>
-                <w:b w:val="0"/>
-                <w:i w:val="0"/>
-                <w:color w:val="000000"/>
-                <w:sz w:val="22"/>
+                <w:rFonts w:ascii="Segoe UI" w:hAnsi="Segoe UI"/>
+                <w:b/>
+                <w:color w:val="FFFFFF"/>
               </w:rPr>
-              <w:t>Ms. Mona Nagar</w:t>
-              <w:br/>
-              <w:t>Assistant Professor</w:t>
-              <w:br/>
-              <w:t>Dept. of CSE (AI)</w:t>
+              <w:t>Department &amp; Semester</w:t>
+            </w:r>
+          </w:p>
+        </w:tc>
+      </w:tr>
+      <w:tr>
+        <w:tc>
+          <w:tcPr>
+            <w:tcW w:type="dxa" w:w="3216"/>
+            <w:shd w:fill="F8FAFC"/>
+          </w:tcPr>
+          <w:p>
+            <w:r>
+              <w:rPr>
+                <w:rFonts w:ascii="Segoe UI" w:hAnsi="Segoe UI"/>
+                <w:sz w:val="19"/>
+              </w:rPr>
+              <w:t>24EJCCA009</w:t>
+            </w:r>
+          </w:p>
+        </w:tc>
+        <w:tc>
+          <w:tcPr>
+            <w:tcW w:type="dxa" w:w="3216"/>
+            <w:shd w:fill="F8FAFC"/>
+          </w:tcPr>
+          <w:p>
+            <w:r>
+              <w:rPr>
+                <w:rFonts w:ascii="Segoe UI" w:hAnsi="Segoe UI"/>
+                <w:sz w:val="19"/>
+              </w:rPr>
+              <w:t>Abhinav Batra</w:t>
+            </w:r>
+          </w:p>
+        </w:tc>
+        <w:tc>
+          <w:tcPr>
+            <w:tcW w:type="dxa" w:w="3216"/>
+            <w:shd w:fill="F8FAFC"/>
+          </w:tcPr>
+          <w:p>
+            <w:r>
+              <w:rPr>
+                <w:rFonts w:ascii="Segoe UI" w:hAnsi="Segoe UI"/>
+                <w:sz w:val="19"/>
+              </w:rPr>
+              <w:t>B.Tech CSE (AI) • 5th Semester</w:t>
+            </w:r>
+          </w:p>
+        </w:tc>
+      </w:tr>
+      <w:tr>
+        <w:tc>
+          <w:tcPr>
+            <w:tcW w:type="dxa" w:w="3216"/>
+            <w:shd w:fill="FFFFFF"/>
+          </w:tcPr>
+          <w:p>
+            <w:r>
+              <w:rPr>
+                <w:rFonts w:ascii="Segoe UI" w:hAnsi="Segoe UI"/>
+                <w:sz w:val="19"/>
+              </w:rPr>
+              <w:t>24EJCCA027</w:t>
+            </w:r>
+          </w:p>
+        </w:tc>
+        <w:tc>
+          <w:tcPr>
+            <w:tcW w:type="dxa" w:w="3216"/>
+            <w:shd w:fill="FFFFFF"/>
+          </w:tcPr>
+          <w:p>
+            <w:r>
+              <w:rPr>
+                <w:rFonts w:ascii="Segoe UI" w:hAnsi="Segoe UI"/>
+                <w:sz w:val="19"/>
+              </w:rPr>
+              <w:t>Amit Kumar</w:t>
+            </w:r>
+          </w:p>
+        </w:tc>
+        <w:tc>
+          <w:tcPr>
+            <w:tcW w:type="dxa" w:w="3216"/>
+            <w:shd w:fill="FFFFFF"/>
+          </w:tcPr>
+          <w:p>
+            <w:r>
+              <w:rPr>
+                <w:rFonts w:ascii="Segoe UI" w:hAnsi="Segoe UI"/>
+                <w:sz w:val="19"/>
+              </w:rPr>
+              <w:t>B.Tech CSE (AI) • 5th Semester</w:t>
+            </w:r>
+          </w:p>
+        </w:tc>
+      </w:tr>
+      <w:tr>
+        <w:tc>
+          <w:tcPr>
+            <w:tcW w:type="dxa" w:w="3216"/>
+            <w:shd w:fill="F8FAFC"/>
+          </w:tcPr>
+          <w:p>
+            <w:r>
+              <w:rPr>
+                <w:rFonts w:ascii="Segoe UI" w:hAnsi="Segoe UI"/>
+                <w:sz w:val="19"/>
+              </w:rPr>
+              <w:t>24EJCCA030</w:t>
+            </w:r>
+          </w:p>
+        </w:tc>
+        <w:tc>
+          <w:tcPr>
+            <w:tcW w:type="dxa" w:w="3216"/>
+            <w:shd w:fill="F8FAFC"/>
+          </w:tcPr>
+          <w:p>
+            <w:r>
+              <w:rPr>
+                <w:rFonts w:ascii="Segoe UI" w:hAnsi="Segoe UI"/>
+                <w:sz w:val="19"/>
+              </w:rPr>
+              <w:t>Anand Gaur</w:t>
+            </w:r>
+          </w:p>
+        </w:tc>
+        <w:tc>
+          <w:tcPr>
+            <w:tcW w:type="dxa" w:w="3216"/>
+            <w:shd w:fill="F8FAFC"/>
+          </w:tcPr>
+          <w:p>
+            <w:r>
+              <w:rPr>
+                <w:rFonts w:ascii="Segoe UI" w:hAnsi="Segoe UI"/>
+                <w:sz w:val="19"/>
+              </w:rPr>
+              <w:t>B.Tech CSE (AI) • 5th Semester</w:t>
+            </w:r>
+          </w:p>
+        </w:tc>
+      </w:tr>
+      <w:tr>
+        <w:tc>
+          <w:tcPr>
+            <w:tcW w:type="dxa" w:w="3216"/>
+            <w:shd w:fill="FFFFFF"/>
+          </w:tcPr>
+          <w:p>
+            <w:r>
+              <w:rPr>
+                <w:rFonts w:ascii="Segoe UI" w:hAnsi="Segoe UI"/>
+                <w:sz w:val="19"/>
+              </w:rPr>
+              <w:t>24EJCCA012</w:t>
+            </w:r>
+          </w:p>
+        </w:tc>
+        <w:tc>
+          <w:tcPr>
+            <w:tcW w:type="dxa" w:w="3216"/>
+            <w:shd w:fill="FFFFFF"/>
+          </w:tcPr>
+          <w:p>
+            <w:r>
+              <w:rPr>
+                <w:rFonts w:ascii="Segoe UI" w:hAnsi="Segoe UI"/>
+                <w:sz w:val="19"/>
+              </w:rPr>
+              <w:t>Abhishek Sihag</w:t>
+            </w:r>
+          </w:p>
+        </w:tc>
+        <w:tc>
+          <w:tcPr>
+            <w:tcW w:type="dxa" w:w="3216"/>
+            <w:shd w:fill="FFFFFF"/>
+          </w:tcPr>
+          <w:p>
+            <w:r>
+              <w:rPr>
+                <w:rFonts w:ascii="Segoe UI" w:hAnsi="Segoe UI"/>
+                <w:sz w:val="19"/>
+              </w:rPr>
+              <w:t>B.Tech CSE (AI) • 5th Semester</w:t>
             </w:r>
           </w:p>
         </w:tc>
@@ -205,535 +314,18 @@
       </w:pPr>
       <w:r>
         <w:rPr>
-          <w:rFonts w:ascii="Times New Roman" w:hAnsi="Times New Roman"/>
+          <w:rFonts w:ascii="Segoe UI" w:hAnsi="Segoe UI"/>
           <w:b/>
-          <w:i w:val="0"/>
-          <w:color w:val="0A285F"/>
-          <w:sz w:val="23"/>
+          <w:color w:val="1E3A8A"/>
+          <w:sz w:val="22"/>
         </w:rPr>
-        <w:t>DEPARTMENT OF</w:t>
+        <w:t>Under the Guidance of:</w:t>
         <w:br/>
-        <w:t>COMPUTER SCIENCE &amp; ENGINEERING (ARTIFICIAL INTELLIGENCE)</w:t>
+        <w:t>Ms. Mona Nagar</w:t>
         <w:br/>
-      </w:r>
-      <w:r>
-        <w:rPr>
-          <w:rFonts w:ascii="Times New Roman" w:hAnsi="Times New Roman"/>
-          <w:b/>
-          <w:i w:val="0"/>
-          <w:color w:val="000000"/>
-          <w:sz w:val="23"/>
-        </w:rPr>
-        <w:t>JAIPUR ENGINEERING COLLEGE AND RESEARCH CENTRE</w:t>
+        <w:t>Assistant Professor, Department of Computer Science &amp; Engineering</w:t>
         <w:br/>
-      </w:r>
-      <w:r>
-        <w:rPr>
-          <w:rFonts w:ascii="Times New Roman" w:hAnsi="Times New Roman"/>
-          <w:b w:val="0"/>
-          <w:i/>
-          <w:color w:val="000000"/>
-          <w:sz w:val="19"/>
-        </w:rPr>
-        <w:t>Shri Ram ki Nangal, via Sitapura RIICO, Tonk Road, Sukhpuria, Bambala, Jaipur, Rajasthan</w:t>
-      </w:r>
-    </w:p>
-    <w:p>
-      <w:r>
-        <w:br w:type="page"/>
-      </w:r>
-    </w:p>
-    <w:p>
-      <w:pPr>
-        <w:jc w:val="center"/>
-      </w:pPr>
-      <w:r>
-        <w:rPr>
-          <w:rFonts w:ascii="Times New Roman" w:hAnsi="Times New Roman"/>
-          <w:b/>
-          <w:i w:val="0"/>
-          <w:color w:val="0A285F"/>
-          <w:sz w:val="36"/>
-        </w:rPr>
-        <w:t>TABLE OF CONTENTS</w:t>
-        <w:br/>
-      </w:r>
-    </w:p>
-    <w:tbl>
-      <w:tblPr>
-        <w:tblW w:type="auto" w:w="0"/>
-        <w:jc w:val="center"/>
-        <w:tblLayout w:type="fixed"/>
-        <w:tblLook w:firstColumn="1" w:firstRow="1" w:lastColumn="0" w:lastRow="0" w:noHBand="0" w:noVBand="1" w:val="04A0"/>
-      </w:tblPr>
-      <w:tblGrid>
-        <w:gridCol w:w="4824"/>
-        <w:gridCol w:w="4824"/>
-      </w:tblGrid>
-      <w:tr>
-        <w:tc>
-          <w:tcPr>
-            <w:tcW w:type="dxa" w:w="7920"/>
-          </w:tcPr>
-          <w:p>
-            <w:r>
-              <w:rPr>
-                <w:rFonts w:ascii="Times New Roman" w:hAnsi="Times New Roman"/>
-                <w:b w:val="0"/>
-                <w:i w:val="0"/>
-                <w:color w:val="000000"/>
-                <w:sz w:val="24"/>
-              </w:rPr>
-              <w:t>Introduction ..............................................</w:t>
-            </w:r>
-          </w:p>
-        </w:tc>
-        <w:tc>
-          <w:tcPr>
-            <w:tcW w:type="dxa" w:w="1440"/>
-          </w:tcPr>
-          <w:p>
-            <w:pPr>
-              <w:jc w:val="right"/>
-            </w:pPr>
-            <w:r>
-              <w:rPr>
-                <w:rFonts w:ascii="Times New Roman" w:hAnsi="Times New Roman"/>
-                <w:b/>
-                <w:i w:val="0"/>
-                <w:color w:val="000000"/>
-                <w:sz w:val="24"/>
-              </w:rPr>
-              <w:t>1</w:t>
-            </w:r>
-          </w:p>
-        </w:tc>
-      </w:tr>
-      <w:tr>
-        <w:tc>
-          <w:tcPr>
-            <w:tcW w:type="dxa" w:w="7920"/>
-          </w:tcPr>
-          <w:p>
-            <w:r>
-              <w:rPr>
-                <w:rFonts w:ascii="Times New Roman" w:hAnsi="Times New Roman"/>
-                <w:b w:val="0"/>
-                <w:i w:val="0"/>
-                <w:color w:val="000000"/>
-                <w:sz w:val="24"/>
-              </w:rPr>
-              <w:t>Objective .................................................</w:t>
-            </w:r>
-          </w:p>
-        </w:tc>
-        <w:tc>
-          <w:tcPr>
-            <w:tcW w:type="dxa" w:w="1440"/>
-          </w:tcPr>
-          <w:p>
-            <w:pPr>
-              <w:jc w:val="right"/>
-            </w:pPr>
-            <w:r>
-              <w:rPr>
-                <w:rFonts w:ascii="Times New Roman" w:hAnsi="Times New Roman"/>
-                <w:b/>
-                <w:i w:val="0"/>
-                <w:color w:val="000000"/>
-                <w:sz w:val="24"/>
-              </w:rPr>
-              <w:t>2</w:t>
-            </w:r>
-          </w:p>
-        </w:tc>
-      </w:tr>
-      <w:tr>
-        <w:tc>
-          <w:tcPr>
-            <w:tcW w:type="dxa" w:w="7920"/>
-          </w:tcPr>
-          <w:p>
-            <w:r>
-              <w:rPr>
-                <w:rFonts w:ascii="Times New Roman" w:hAnsi="Times New Roman"/>
-                <w:b w:val="0"/>
-                <w:i w:val="0"/>
-                <w:color w:val="000000"/>
-                <w:sz w:val="24"/>
-              </w:rPr>
-              <w:t>Methodology And Planning ..................................</w:t>
-            </w:r>
-          </w:p>
-        </w:tc>
-        <w:tc>
-          <w:tcPr>
-            <w:tcW w:type="dxa" w:w="1440"/>
-          </w:tcPr>
-          <w:p>
-            <w:pPr>
-              <w:jc w:val="right"/>
-            </w:pPr>
-            <w:r>
-              <w:rPr>
-                <w:rFonts w:ascii="Times New Roman" w:hAnsi="Times New Roman"/>
-                <w:b/>
-                <w:i w:val="0"/>
-                <w:color w:val="000000"/>
-                <w:sz w:val="24"/>
-              </w:rPr>
-              <w:t>3</w:t>
-            </w:r>
-          </w:p>
-        </w:tc>
-      </w:tr>
-      <w:tr>
-        <w:tc>
-          <w:tcPr>
-            <w:tcW w:type="dxa" w:w="7920"/>
-          </w:tcPr>
-          <w:p>
-            <w:r>
-              <w:rPr>
-                <w:rFonts w:ascii="Times New Roman" w:hAnsi="Times New Roman"/>
-                <w:b w:val="0"/>
-                <w:i w:val="0"/>
-                <w:color w:val="000000"/>
-                <w:sz w:val="24"/>
-              </w:rPr>
-              <w:t>Literature Review .........................................</w:t>
-            </w:r>
-          </w:p>
-        </w:tc>
-        <w:tc>
-          <w:tcPr>
-            <w:tcW w:type="dxa" w:w="1440"/>
-          </w:tcPr>
-          <w:p>
-            <w:pPr>
-              <w:jc w:val="right"/>
-            </w:pPr>
-            <w:r>
-              <w:rPr>
-                <w:rFonts w:ascii="Times New Roman" w:hAnsi="Times New Roman"/>
-                <w:b/>
-                <w:i w:val="0"/>
-                <w:color w:val="000000"/>
-                <w:sz w:val="24"/>
-              </w:rPr>
-              <w:t>4</w:t>
-            </w:r>
-          </w:p>
-        </w:tc>
-      </w:tr>
-      <w:tr>
-        <w:tc>
-          <w:tcPr>
-            <w:tcW w:type="dxa" w:w="7920"/>
-          </w:tcPr>
-          <w:p>
-            <w:r>
-              <w:rPr>
-                <w:rFonts w:ascii="Times New Roman" w:hAnsi="Times New Roman"/>
-                <w:b w:val="0"/>
-                <w:i w:val="0"/>
-                <w:color w:val="000000"/>
-                <w:sz w:val="24"/>
-              </w:rPr>
-              <w:t>Applications of the Project ...............................</w:t>
-            </w:r>
-          </w:p>
-        </w:tc>
-        <w:tc>
-          <w:tcPr>
-            <w:tcW w:type="dxa" w:w="1440"/>
-          </w:tcPr>
-          <w:p>
-            <w:pPr>
-              <w:jc w:val="right"/>
-            </w:pPr>
-            <w:r>
-              <w:rPr>
-                <w:rFonts w:ascii="Times New Roman" w:hAnsi="Times New Roman"/>
-                <w:b/>
-                <w:i w:val="0"/>
-                <w:color w:val="000000"/>
-                <w:sz w:val="24"/>
-              </w:rPr>
-              <w:t>5</w:t>
-            </w:r>
-          </w:p>
-        </w:tc>
-      </w:tr>
-      <w:tr>
-        <w:tc>
-          <w:tcPr>
-            <w:tcW w:type="dxa" w:w="7920"/>
-          </w:tcPr>
-          <w:p>
-            <w:r>
-              <w:rPr>
-                <w:rFonts w:ascii="Times New Roman" w:hAnsi="Times New Roman"/>
-                <w:b w:val="0"/>
-                <w:i w:val="0"/>
-                <w:color w:val="000000"/>
-                <w:sz w:val="24"/>
-              </w:rPr>
-              <w:t>Block Diagram .............................................</w:t>
-            </w:r>
-          </w:p>
-        </w:tc>
-        <w:tc>
-          <w:tcPr>
-            <w:tcW w:type="dxa" w:w="1440"/>
-          </w:tcPr>
-          <w:p>
-            <w:pPr>
-              <w:jc w:val="right"/>
-            </w:pPr>
-            <w:r>
-              <w:rPr>
-                <w:rFonts w:ascii="Times New Roman" w:hAnsi="Times New Roman"/>
-                <w:b/>
-                <w:i w:val="0"/>
-                <w:color w:val="000000"/>
-                <w:sz w:val="24"/>
-              </w:rPr>
-              <w:t>6</w:t>
-            </w:r>
-          </w:p>
-        </w:tc>
-      </w:tr>
-      <w:tr>
-        <w:tc>
-          <w:tcPr>
-            <w:tcW w:type="dxa" w:w="7920"/>
-          </w:tcPr>
-          <w:p>
-            <w:r>
-              <w:rPr>
-                <w:rFonts w:ascii="Times New Roman" w:hAnsi="Times New Roman"/>
-                <w:b w:val="0"/>
-                <w:i w:val="0"/>
-                <w:color w:val="000000"/>
-                <w:sz w:val="24"/>
-              </w:rPr>
-              <w:t>UML Diagram ...............................................</w:t>
-            </w:r>
-          </w:p>
-        </w:tc>
-        <w:tc>
-          <w:tcPr>
-            <w:tcW w:type="dxa" w:w="1440"/>
-          </w:tcPr>
-          <w:p>
-            <w:pPr>
-              <w:jc w:val="right"/>
-            </w:pPr>
-            <w:r>
-              <w:rPr>
-                <w:rFonts w:ascii="Times New Roman" w:hAnsi="Times New Roman"/>
-                <w:b/>
-                <w:i w:val="0"/>
-                <w:color w:val="000000"/>
-                <w:sz w:val="24"/>
-              </w:rPr>
-              <w:t>7</w:t>
-            </w:r>
-          </w:p>
-        </w:tc>
-      </w:tr>
-      <w:tr>
-        <w:tc>
-          <w:tcPr>
-            <w:tcW w:type="dxa" w:w="7920"/>
-          </w:tcPr>
-          <w:p>
-            <w:r>
-              <w:rPr>
-                <w:rFonts w:ascii="Times New Roman" w:hAnsi="Times New Roman"/>
-                <w:b w:val="0"/>
-                <w:i w:val="0"/>
-                <w:color w:val="000000"/>
-                <w:sz w:val="24"/>
-              </w:rPr>
-              <w:t>Screenshots ...............................................</w:t>
-            </w:r>
-          </w:p>
-        </w:tc>
-        <w:tc>
-          <w:tcPr>
-            <w:tcW w:type="dxa" w:w="1440"/>
-          </w:tcPr>
-          <w:p>
-            <w:pPr>
-              <w:jc w:val="right"/>
-            </w:pPr>
-            <w:r>
-              <w:rPr>
-                <w:rFonts w:ascii="Times New Roman" w:hAnsi="Times New Roman"/>
-                <w:b/>
-                <w:i w:val="0"/>
-                <w:color w:val="000000"/>
-                <w:sz w:val="24"/>
-              </w:rPr>
-              <w:t>8</w:t>
-            </w:r>
-          </w:p>
-        </w:tc>
-      </w:tr>
-      <w:tr>
-        <w:tc>
-          <w:tcPr>
-            <w:tcW w:type="dxa" w:w="7920"/>
-          </w:tcPr>
-          <w:p>
-            <w:r>
-              <w:rPr>
-                <w:rFonts w:ascii="Times New Roman" w:hAnsi="Times New Roman"/>
-                <w:b w:val="0"/>
-                <w:i w:val="0"/>
-                <w:color w:val="000000"/>
-                <w:sz w:val="24"/>
-              </w:rPr>
-              <w:t>References ................................................</w:t>
-            </w:r>
-          </w:p>
-        </w:tc>
-        <w:tc>
-          <w:tcPr>
-            <w:tcW w:type="dxa" w:w="1440"/>
-          </w:tcPr>
-          <w:p>
-            <w:pPr>
-              <w:jc w:val="right"/>
-            </w:pPr>
-            <w:r>
-              <w:rPr>
-                <w:rFonts w:ascii="Times New Roman" w:hAnsi="Times New Roman"/>
-                <w:b/>
-                <w:i w:val="0"/>
-                <w:color w:val="000000"/>
-                <w:sz w:val="24"/>
-              </w:rPr>
-              <w:t>9</w:t>
-            </w:r>
-          </w:p>
-        </w:tc>
-      </w:tr>
-      <w:tr>
-        <w:tc>
-          <w:tcPr>
-            <w:tcW w:type="dxa" w:w="7920"/>
-          </w:tcPr>
-          <w:p>
-            <w:r>
-              <w:rPr>
-                <w:rFonts w:ascii="Times New Roman" w:hAnsi="Times New Roman"/>
-                <w:b w:val="0"/>
-                <w:i w:val="0"/>
-                <w:color w:val="000000"/>
-                <w:sz w:val="24"/>
-              </w:rPr>
-              <w:t>Approval of the Project ...................................</w:t>
-            </w:r>
-          </w:p>
-        </w:tc>
-        <w:tc>
-          <w:tcPr>
-            <w:tcW w:type="dxa" w:w="1440"/>
-          </w:tcPr>
-          <w:p>
-            <w:pPr>
-              <w:jc w:val="right"/>
-            </w:pPr>
-            <w:r>
-              <w:rPr>
-                <w:rFonts w:ascii="Times New Roman" w:hAnsi="Times New Roman"/>
-                <w:b/>
-                <w:i w:val="0"/>
-                <w:color w:val="000000"/>
-                <w:sz w:val="24"/>
-              </w:rPr>
-              <w:t>10</w:t>
-            </w:r>
-          </w:p>
-        </w:tc>
-      </w:tr>
-    </w:tbl>
-    <w:p>
-      <w:r>
-        <w:br w:type="page"/>
-      </w:r>
-    </w:p>
-    <w:p>
-      <w:r>
-        <w:rPr>
-          <w:rFonts w:ascii="Times New Roman" w:hAnsi="Times New Roman"/>
-          <w:b/>
-          <w:i w:val="0"/>
-          <w:color w:val="0A285F"/>
-          <w:sz w:val="32"/>
-        </w:rPr>
-        <w:t>1. Introduction</w:t>
-        <w:br/>
-      </w:r>
-    </w:p>
-    <w:p>
-      <w:pPr>
-        <w:jc w:val="both"/>
-      </w:pPr>
-      <w:r>
-        <w:rPr>
-          <w:rFonts w:ascii="Times New Roman" w:hAnsi="Times New Roman"/>
-          <w:b w:val="0"/>
-          <w:i w:val="0"/>
-          <w:color w:val="000000"/>
-          <w:sz w:val="23"/>
-        </w:rPr>
-        <w:t>In the contemporary computing era, distributed applications and networked real-time communication systems are vital for organizational collaboration. This project, titled 'Multi-Threaded Client-Server Chat Application', implements a comprehensive, multi-user communication environment programmed in pure Core Java (JDK 25). The system utilizes reliable transport-layer TCP/IP sockets via java.net, high-throughput worker thread management via java.util.concurrent.ExecutorService, an interactive Swing Graphical User Interface, and persistent relational data storage using MySQL 8.0 and JDBC.</w:t>
-        <w:br/>
-        <w:br/>
-        <w:t>The project is architected to address standard challenges in networked desktop applications, including thread exhaustion, UI freezes caused by blocking I/O, secure credential storage, and synchronized real-time client presence.</w:t>
-      </w:r>
-    </w:p>
-    <w:p>
-      <w:r>
-        <w:rPr>
-          <w:rFonts w:ascii="Times New Roman" w:hAnsi="Times New Roman"/>
-          <w:b/>
-          <w:i w:val="0"/>
-          <w:color w:val="0A285F"/>
-          <w:sz w:val="32"/>
-        </w:rPr>
-        <w:br/>
-        <w:t>2. Objective</w:t>
-        <w:br/>
-      </w:r>
-    </w:p>
-    <w:p>
-      <w:pPr>
-        <w:jc w:val="both"/>
-      </w:pPr>
-      <w:r>
-        <w:rPr>
-          <w:rFonts w:ascii="Times New Roman" w:hAnsi="Times New Roman"/>
-          <w:b w:val="0"/>
-          <w:i w:val="0"/>
-          <w:color w:val="000000"/>
-          <w:sz w:val="23"/>
-        </w:rPr>
-        <w:t>The primary objectives of this project are:</w:t>
-        <w:br/>
-        <w:t>1. Concurrency Management: Build a multi-threaded server using ExecutorService thread pooling that dynamically handles multiple simultaneous client connections.</w:t>
-        <w:br/>
-        <w:t>2. Bi-directional Messaging: Provide both global broadcast messaging (all active users) and private point-to-point messaging (1-to-1 dialogue).</w:t>
-        <w:br/>
-        <w:t>3. Real-Time Presence Detection: Maintain an accurate, synchronized active contacts roster with live status updates upon client connection or disconnection.</w:t>
-        <w:br/>
-        <w:t>4. Robust Persistence &amp; Security: Authenticate users against a MySQL database using SHA-256 password hashing, preventing SQL injection via JDBC PreparedStatements, and load past chat history upon login.</w:t>
-        <w:br/>
-        <w:t>5. Fluid GUI Architecture: Design a non-blocking Swing GUI where network I/O operations are strictly segregated from the Event Dispatch Thread (EDT).</w:t>
+        <w:t>JECRC, Jaipur</w:t>
       </w:r>
     </w:p>
     <w:p>
@@ -744,557 +336,197 @@
     <w:p>
       <w:r>
         <w:rPr>
-          <w:rFonts w:ascii="Times New Roman" w:hAnsi="Times New Roman"/>
+          <w:rFonts w:ascii="Segoe UI" w:hAnsi="Segoe UI"/>
           <w:b/>
-          <w:i w:val="0"/>
-          <w:color w:val="0A285F"/>
-          <w:sz w:val="32"/>
+          <w:color w:val="1E3A8A"/>
+          <w:sz w:val="26"/>
         </w:rPr>
-        <w:t>3. Methodology And Planning</w:t>
-        <w:br/>
+        <w:t>Chapter 1: Executive Summary &amp; Project Motivation</w:t>
       </w:r>
     </w:p>
     <w:p>
       <w:pPr>
-        <w:jc w:val="both"/>
+        <w:spacing w:line="276" w:lineRule="auto"/>
       </w:pPr>
       <w:r>
         <w:rPr>
-          <w:rFonts w:ascii="Times New Roman" w:hAnsi="Times New Roman"/>
-          <w:b w:val="0"/>
-          <w:i w:val="0"/>
-          <w:color w:val="000000"/>
-          <w:sz w:val="23"/>
+          <w:rFonts w:ascii="Segoe UI" w:hAnsi="Segoe UI"/>
+          <w:color w:val="334155"/>
+          <w:sz w:val="21"/>
         </w:rPr>
-        <w:t>The development methodology followed an iterative, component-driven engineering model divided into four distinct phases:</w:t>
-        <w:br/>
-        <w:br/>
-        <w:t>Phase 1 - Database Schema &amp; Persistence Layer:</w:t>
-        <w:br/>
-        <w:t>Designed the relational schema consisting of 'users' and 'messages' tables in MySQL. Implemented DBHandler.java using standard JDBC. PreparedStatements were utilized to parameterize all queries, and MessageDigest was applied to compute 64-character SHA-256 password hashes.</w:t>
-        <w:br/>
-        <w:br/>
-        <w:t>Phase 2 - Network Protocol &amp; Server Engineering:</w:t>
-        <w:br/>
-        <w:t>Formulated a clean, deterministic pipe-delimited application layer protocol (e.g., LOGIN|&lt;user&gt;|&lt;pass&gt;, BROADCAST|&lt;msg&gt;, PRIVATE|&lt;rcpt&gt;|&lt;msg&gt;). Engineered ChatServer.java with a ServerSocket listening on TCP port 12345, utilizing Executors.newCachedThreadPool() to assign ClientHandler runnables dynamically. Client sessions are stored thread-safely in a ConcurrentHashMap.</w:t>
-        <w:br/>
-        <w:br/>
-        <w:t>Phase 3 - Client Networking &amp; GUI Construction:</w:t>
-        <w:br/>
-        <w:t>Developed ChatClient.java with a dedicated background thread to read inbound socket data. Constructed ChatGUI.java using Java Swing (CardLayout, JTextPane, JList). Applied SwingUtilities.invokeLater() to ensure thread-safe updates to the UI.</w:t>
-        <w:br/>
-        <w:br/>
-        <w:t>Phase 4 - System Integration &amp; Verification:</w:t>
-        <w:br/>
-        <w:t>Conducted end-to-end integration tests using JDK 25 and MySQL 8.0, verifying concurrent logins, message delivery latency, and clean resource deallocation on window closing events.</w:t>
+        <w:t>Higher education environments thrive on timely and dependable information flow. Faculty coordination, exam invigilation, departmental reviews, and administrative notices demand high reliability. Traditional dependence on external messengers suffers from privacy concerns, message dilution, and internet vulnerabilities. JECRC StaffNet addresses this by establishing a high-performance, private campus intranet communication application developed natively using pure Java Standard Edition (JDK 25), TCP/IP Sockets, Swing GUI with HTML/CSS rendering, and MySQL 8.0 database persistence.</w:t>
       </w:r>
     </w:p>
     <w:p>
       <w:r>
         <w:rPr>
-          <w:rFonts w:ascii="Times New Roman" w:hAnsi="Times New Roman"/>
+          <w:rFonts w:ascii="Segoe UI" w:hAnsi="Segoe UI"/>
           <w:b/>
-          <w:i w:val="0"/>
-          <w:color w:val="0A285F"/>
-          <w:sz w:val="32"/>
+          <w:color w:val="1E3A8A"/>
+          <w:sz w:val="26"/>
         </w:rPr>
-        <w:br/>
-        <w:t>4. Literature Review</w:t>
-        <w:br/>
+        <w:t>Chapter 2: College Staff Domain Model &amp; Use Cases</w:t>
       </w:r>
     </w:p>
     <w:p>
       <w:pPr>
-        <w:jc w:val="both"/>
+        <w:spacing w:line="276" w:lineRule="auto"/>
       </w:pPr>
       <w:r>
         <w:rPr>
-          <w:rFonts w:ascii="Times New Roman" w:hAnsi="Times New Roman"/>
-          <w:b w:val="0"/>
-          <w:i w:val="0"/>
-          <w:color w:val="000000"/>
-          <w:sz w:val="23"/>
+          <w:rFonts w:ascii="Segoe UI" w:hAnsi="Segoe UI"/>
+          <w:color w:val="334155"/>
+          <w:sz w:val="21"/>
         </w:rPr>
-        <w:t>Distributed messaging architectures have evolved from early monolithic, synchronous systems to event-driven and multi-threaded paradigms. Harold (2014) highlights that traditional single-threaded socket architectures create severe I/O bottlenecks when scaling beyond minimal client counts, advocating for thread pooling mechanisms that reuse operating system threads rather than instantiating unbounded threads per connection. Goetz et al. (2006) discuss concurrent synchronization primitives, noting that ConcurrentHashMap achieves high concurrency through lock-free reads and granular write locks, which is ideal for server-side active user registries. Furthermore, Schildt (2021) emphasizes that graphical desktop frameworks like Swing follow a single-thread rule where all visual mutations must occur on the Event Dispatch Thread (EDT) to avert deadlock and race conditions. This project synthesizes these established paradigms to construct a production-quality, educational client-server framework.</w:t>
-      </w:r>
-    </w:p>
-    <w:p>
-      <w:r>
-        <w:br w:type="page"/>
+        <w:t>The system provides dedicated features tailored to higher educational staff roles:</w:t>
+        <w:br/>
+        <w:t>1. Role &amp; Designation Aware Directory: Displays staff with real-time designations (HOD, Assistant Professor, Exam Coordinator, Lab Incharge).</w:t>
+        <w:br/>
+        <w:t>2. Categorized Notice Dissemination: Staff can broadcast notices tagged as:</w:t>
+        <w:br/>
+        <w:t xml:space="preserve">   • 🚨 Urgent Directive: Immediate compliance notices (red badge card)</w:t>
+        <w:br/>
+        <w:t xml:space="preserve">   • 📋 Meeting Notice / MoM: Academic council and departmental meetings (amber badge card)</w:t>
+        <w:br/>
+        <w:t xml:space="preserve">   • 📝 Exam Cell Notice: Mid-term/end-term duty rosters and invigilation slots (blue badge card)</w:t>
+        <w:br/>
+        <w:t xml:space="preserve">   • 🔬 Lab Infrastructure Notice: Computing hardware, software installations, and batch timings (green badge card)</w:t>
+        <w:br/>
+        <w:t xml:space="preserve">   • 📢 General Circular: Campus holidays, library timings, and academic circulars (indigo badge card)</w:t>
+        <w:br/>
+        <w:t>3. Confidential Staff Memos: Dedicated 1-to-1 secure private communication channels with pop-out window capabilities.</w:t>
+        <w:br/>
+        <w:t>4. Academic Document Sharing: Direct transfer of PDF circulars, PPT seminar presentations, Word duty rosters, and Excel grade registers directly over socket streams without third-party cloud dependence.</w:t>
       </w:r>
     </w:p>
     <w:p>
       <w:r>
         <w:rPr>
-          <w:rFonts w:ascii="Times New Roman" w:hAnsi="Times New Roman"/>
+          <w:rFonts w:ascii="Segoe UI" w:hAnsi="Segoe UI"/>
           <w:b/>
-          <w:i w:val="0"/>
-          <w:color w:val="0A285F"/>
-          <w:sz w:val="32"/>
+          <w:color w:val="1E3A8A"/>
+          <w:sz w:val="26"/>
         </w:rPr>
-        <w:t>5. Applications of the Project</w:t>
-        <w:br/>
+        <w:t>Chapter 3: Technical Architecture &amp; Core Java Concepts</w:t>
       </w:r>
     </w:p>
     <w:p>
       <w:pPr>
-        <w:jc w:val="both"/>
+        <w:spacing w:line="276" w:lineRule="auto"/>
       </w:pPr>
       <w:r>
         <w:rPr>
-          <w:rFonts w:ascii="Times New Roman" w:hAnsi="Times New Roman"/>
-          <w:b w:val="0"/>
-          <w:i w:val="0"/>
-          <w:color w:val="000000"/>
-          <w:sz w:val="23"/>
+          <w:rFonts w:ascii="Segoe UI" w:hAnsi="Segoe UI"/>
+          <w:color w:val="334155"/>
+          <w:sz w:val="21"/>
         </w:rPr>
-        <w:t>1. Academic &amp; Institutional Intranets: Provides private, secure, local-network messaging for computer science laboratories and campus faculties.</w:t>
+        <w:t>The project satisfies the rigorous curriculum standards of the Advanced Java Laboratory:</w:t>
         <w:br/>
-        <w:t>2. Corporate Internal Chat: Serves as a standalone, internal communication tool that operates without reliance on external cloud servers, preserving company data sovereignty.</w:t>
+        <w:t>• java.net.ServerSocket &amp; Socket: Low-level TCP streaming on port 12345. Non-blocking character I/O streams configured with UTF-8 encoding.</w:t>
         <w:br/>
-        <w:t>3. Real-Time Customer Support Systems: The underlying multi-threaded socket and routing infrastructure can be extended to customer assistance desks for immediate agent-client interactions.</w:t>
+        <w:t>• Concurrency &amp; Thread Pooling: Dynamic thread management using java.util.concurrent.ExecutorService. ConcurrentHashMap guarantees race-condition free client session lookups.</w:t>
         <w:br/>
-        <w:t>4. Modular Foundation for Distributed Systems: Acts as a foundational framework for distributed computing labs, illustrating advanced synchronization, socket state machines, and relational storage.</w:t>
+        <w:t>• Java Swing &amp; HTML/CSS Rendering: Embedded JEditorPane rendering real-time CSS speech cards and alert badges on the Event Dispatch Thread (SwingUtilities.invokeLater).</w:t>
+        <w:br/>
+        <w:t>• JDBC &amp; MySQL 8.0: Externalized db.properties credential loading, SHA-256 password hashing via java.security.MessageDigest, and PreparedStatements for SQL injection prevention.</w:t>
       </w:r>
     </w:p>
     <w:p>
       <w:r>
         <w:rPr>
-          <w:rFonts w:ascii="Times New Roman" w:hAnsi="Times New Roman"/>
+          <w:rFonts w:ascii="Segoe UI" w:hAnsi="Segoe UI"/>
           <w:b/>
-          <w:i w:val="0"/>
-          <w:color w:val="0A285F"/>
-          <w:sz w:val="32"/>
+          <w:color w:val="1E3A8A"/>
+          <w:sz w:val="26"/>
         </w:rPr>
-        <w:br/>
-        <w:t>6. Block Diagram</w:t>
-        <w:br/>
+        <w:t>Chapter 4: Offline Intranet Security &amp; Reliability</w:t>
       </w:r>
     </w:p>
     <w:p>
       <w:pPr>
-        <w:jc w:val="center"/>
-      </w:pPr>
-    </w:p>
-    <w:p>
-      <w:r>
-        <w:drawing>
-          <wp:inline xmlns:a="http://schemas.openxmlformats.org/drawingml/2006/main" xmlns:pic="http://schemas.openxmlformats.org/drawingml/2006/picture">
-            <wp:extent cx="5486400" cy="3271876"/>
-            <wp:docPr id="1" name="Picture 1"/>
-            <wp:cNvGraphicFramePr>
-              <a:graphicFrameLocks noChangeAspect="1"/>
-            </wp:cNvGraphicFramePr>
-            <a:graphic>
-              <a:graphicData uri="http://schemas.openxmlformats.org/drawingml/2006/picture">
-                <pic:pic>
-                  <pic:nvPicPr>
-                    <pic:cNvPr id="0" name="block_diagram.png"/>
-                    <pic:cNvPicPr/>
-                  </pic:nvPicPr>
-                  <pic:blipFill>
-                    <a:blip r:embed="rId9"/>
-                    <a:stretch>
-                      <a:fillRect/>
-                    </a:stretch>
-                  </pic:blipFill>
-                  <pic:spPr>
-                    <a:xfrm>
-                      <a:off x="0" y="0"/>
-                      <a:ext cx="5486400" cy="3271876"/>
-                    </a:xfrm>
-                    <a:prstGeom prst="rect"/>
-                  </pic:spPr>
-                </pic:pic>
-              </a:graphicData>
-            </a:graphic>
-          </wp:inline>
-        </w:drawing>
-      </w:r>
-    </w:p>
-    <w:p>
-      <w:pPr>
-        <w:jc w:val="center"/>
+        <w:spacing w:line="276" w:lineRule="auto"/>
       </w:pPr>
       <w:r>
         <w:rPr>
-          <w:rFonts w:ascii="Times New Roman" w:hAnsi="Times New Roman"/>
-          <w:b w:val="0"/>
-          <w:i/>
-          <w:color w:val="000000"/>
-          <w:sz w:val="20"/>
+          <w:rFonts w:ascii="Segoe UI" w:hAnsi="Segoe UI"/>
+          <w:color w:val="334155"/>
+          <w:sz w:val="21"/>
         </w:rPr>
-        <w:t>Figure 6.1: High-Level System Architecture and Component Interfacing</w:t>
-      </w:r>
-    </w:p>
-    <w:p>
-      <w:r>
-        <w:br w:type="page"/>
+        <w:t>A key pedagogical and operational achievement of JECRC StaffNet is complete offline resilience. All socket packets travel either over localhost (127.0.0.1) or across the campus Local Area Network (LAN/WLAN). The MySQL database runs locally, and file transfers are encoded via Base64 binary streams directly into the local downloads/ directory. This ensures total data sovereignty, zero dependence on telecom gateways, and immunity to internet failures during critical exam periods.</w:t>
       </w:r>
     </w:p>
     <w:p>
       <w:r>
         <w:rPr>
-          <w:rFonts w:ascii="Times New Roman" w:hAnsi="Times New Roman"/>
+          <w:rFonts w:ascii="Segoe UI" w:hAnsi="Segoe UI"/>
           <w:b/>
-          <w:i w:val="0"/>
-          <w:color w:val="0A285F"/>
-          <w:sz w:val="32"/>
+          <w:color w:val="1E3A8A"/>
+          <w:sz w:val="26"/>
         </w:rPr>
-        <w:t>7. UML Diagram</w:t>
-        <w:br/>
+        <w:t>Chapter 5: Conclusion &amp; Future Scope</w:t>
       </w:r>
     </w:p>
     <w:p>
       <w:pPr>
-        <w:jc w:val="center"/>
-      </w:pPr>
-    </w:p>
-    <w:p>
-      <w:r>
-        <w:drawing>
-          <wp:inline xmlns:a="http://schemas.openxmlformats.org/drawingml/2006/main" xmlns:pic="http://schemas.openxmlformats.org/drawingml/2006/picture">
-            <wp:extent cx="5669280" cy="3588810"/>
-            <wp:docPr id="2" name="Picture 2"/>
-            <wp:cNvGraphicFramePr>
-              <a:graphicFrameLocks noChangeAspect="1"/>
-            </wp:cNvGraphicFramePr>
-            <a:graphic>
-              <a:graphicData uri="http://schemas.openxmlformats.org/drawingml/2006/picture">
-                <pic:pic>
-                  <pic:nvPicPr>
-                    <pic:cNvPr id="0" name="uml_diagram.png"/>
-                    <pic:cNvPicPr/>
-                  </pic:nvPicPr>
-                  <pic:blipFill>
-                    <a:blip r:embed="rId10"/>
-                    <a:stretch>
-                      <a:fillRect/>
-                    </a:stretch>
-                  </pic:blipFill>
-                  <pic:spPr>
-                    <a:xfrm>
-                      <a:off x="0" y="0"/>
-                      <a:ext cx="5669280" cy="3588810"/>
-                    </a:xfrm>
-                    <a:prstGeom prst="rect"/>
-                  </pic:spPr>
-                </pic:pic>
-              </a:graphicData>
-            </a:graphic>
-          </wp:inline>
-        </w:drawing>
-      </w:r>
-    </w:p>
-    <w:p>
-      <w:pPr>
-        <w:jc w:val="center"/>
+        <w:spacing w:line="276" w:lineRule="auto"/>
       </w:pPr>
       <w:r>
         <w:rPr>
-          <w:rFonts w:ascii="Times New Roman" w:hAnsi="Times New Roman"/>
-          <w:b w:val="0"/>
-          <w:i/>
-          <w:color w:val="000000"/>
-          <w:sz w:val="20"/>
+          <w:rFonts w:ascii="Segoe UI" w:hAnsi="Segoe UI"/>
+          <w:color w:val="334155"/>
+          <w:sz w:val="21"/>
         </w:rPr>
-        <w:t>Figure 7.1: UML Class Diagram Depicting Classes, Methods, and Inter-Object Associations</w:t>
+        <w:t>JECRC StaffNet successfully delivers an institution-grade, secure, and intuitive staff communication platform. Future iterations may include departmental sub-channels, biometric authentication integration, and digital signatures for official college circulars.</w:t>
       </w:r>
     </w:p>
-    <w:p>
-      <w:r>
-        <w:rPr>
-          <w:rFonts w:ascii="Times New Roman" w:hAnsi="Times New Roman"/>
-          <w:b/>
-          <w:i w:val="0"/>
-          <w:color w:val="0A285F"/>
-          <w:sz w:val="32"/>
-        </w:rPr>
-        <w:br/>
-        <w:t>8. Screenshots</w:t>
-        <w:br/>
-      </w:r>
-    </w:p>
-    <w:p>
-      <w:pPr>
-        <w:jc w:val="center"/>
-      </w:pPr>
-    </w:p>
-    <w:p>
-      <w:r>
-        <w:drawing>
-          <wp:inline xmlns:a="http://schemas.openxmlformats.org/drawingml/2006/main" xmlns:pic="http://schemas.openxmlformats.org/drawingml/2006/picture">
-            <wp:extent cx="5029200" cy="3590181"/>
-            <wp:docPr id="3" name="Picture 3"/>
-            <wp:cNvGraphicFramePr>
-              <a:graphicFrameLocks noChangeAspect="1"/>
-            </wp:cNvGraphicFramePr>
-            <a:graphic>
-              <a:graphicData uri="http://schemas.openxmlformats.org/drawingml/2006/picture">
-                <pic:pic>
-                  <pic:nvPicPr>
-                    <pic:cNvPr id="0" name="login_screenshot.png"/>
-                    <pic:cNvPicPr/>
-                  </pic:nvPicPr>
-                  <pic:blipFill>
-                    <a:blip r:embed="rId11"/>
-                    <a:stretch>
-                      <a:fillRect/>
-                    </a:stretch>
-                  </pic:blipFill>
-                  <pic:spPr>
-                    <a:xfrm>
-                      <a:off x="0" y="0"/>
-                      <a:ext cx="5029200" cy="3590181"/>
-                    </a:xfrm>
-                    <a:prstGeom prst="rect"/>
-                  </pic:spPr>
-                </pic:pic>
-              </a:graphicData>
-            </a:graphic>
-          </wp:inline>
-        </w:drawing>
-      </w:r>
-    </w:p>
-    <w:p>
-      <w:pPr>
-        <w:jc w:val="center"/>
-      </w:pPr>
-      <w:r>
-        <w:rPr>
-          <w:rFonts w:ascii="Times New Roman" w:hAnsi="Times New Roman"/>
-          <w:b w:val="0"/>
-          <w:i/>
-          <w:color w:val="000000"/>
-          <w:sz w:val="20"/>
-        </w:rPr>
-        <w:t>Figure 8.1: Swing Graphical User Interface - Authentication Screen (Login &amp; Registration)</w:t>
-      </w:r>
-    </w:p>
-    <w:p>
-      <w:r>
-        <w:br w:type="page"/>
-      </w:r>
-    </w:p>
-    <w:p>
-      <w:r>
-        <w:rPr>
-          <w:rFonts w:ascii="Times New Roman" w:hAnsi="Times New Roman"/>
-          <w:b/>
-          <w:i w:val="0"/>
-          <w:color w:val="0A285F"/>
-          <w:sz w:val="32"/>
-        </w:rPr>
-        <w:t>9. References</w:t>
-        <w:br/>
-      </w:r>
-    </w:p>
-    <w:p>
-      <w:pPr>
-        <w:spacing w:after="160"/>
-        <w:ind w:left="576"/>
-      </w:pPr>
-      <w:r>
-        <w:rPr>
-          <w:rFonts w:ascii="Times New Roman" w:hAnsi="Times New Roman"/>
-          <w:b w:val="0"/>
-          <w:i w:val="0"/>
-          <w:color w:val="000000"/>
-          <w:sz w:val="22"/>
-        </w:rPr>
-        <w:t>[1] Herbert Schildt, 'Java: The Complete Reference', 12th Edition, McGraw-Hill Education, 2021.</w:t>
-      </w:r>
-    </w:p>
-    <w:p>
-      <w:pPr>
-        <w:spacing w:after="160"/>
-        <w:ind w:left="576"/>
-      </w:pPr>
-      <w:r>
-        <w:rPr>
-          <w:rFonts w:ascii="Times New Roman" w:hAnsi="Times New Roman"/>
-          <w:b w:val="0"/>
-          <w:i w:val="0"/>
-          <w:color w:val="000000"/>
-          <w:sz w:val="22"/>
-        </w:rPr>
-        <w:t>[2] Elliotte Rusty Harold, 'Java Network Programming: Developing Networked Applications', 4th Edition, O'Reilly Media, 2014.</w:t>
-      </w:r>
-    </w:p>
-    <w:p>
-      <w:pPr>
-        <w:spacing w:after="160"/>
-        <w:ind w:left="576"/>
-      </w:pPr>
-      <w:r>
-        <w:rPr>
-          <w:rFonts w:ascii="Times New Roman" w:hAnsi="Times New Roman"/>
-          <w:b w:val="0"/>
-          <w:i w:val="0"/>
-          <w:color w:val="000000"/>
-          <w:sz w:val="22"/>
-        </w:rPr>
-        <w:t>[3] Brian Goetz, Tim Peierls, Joshua Bloch, Joseph Bowbeer, David Holmes, Doug Lea, 'Java Concurrency in Practice', Addison-Wesley Professional, 2006.</w:t>
-      </w:r>
-    </w:p>
-    <w:p>
-      <w:pPr>
-        <w:spacing w:after="160"/>
-        <w:ind w:left="576"/>
-      </w:pPr>
-      <w:r>
-        <w:rPr>
-          <w:rFonts w:ascii="Times New Roman" w:hAnsi="Times New Roman"/>
-          <w:b w:val="0"/>
-          <w:i w:val="0"/>
-          <w:color w:val="000000"/>
-          <w:sz w:val="22"/>
-        </w:rPr>
-        <w:t>[4] Oracle Corporation, 'Java Platform, Standard Edition Documentation - Socket, ServerSocket &amp; Concurrency Utilities', Oracle Technology Network.</w:t>
-      </w:r>
-    </w:p>
-    <w:p>
-      <w:pPr>
-        <w:spacing w:after="160"/>
-        <w:ind w:left="576"/>
-      </w:pPr>
-      <w:r>
-        <w:rPr>
-          <w:rFonts w:ascii="Times New Roman" w:hAnsi="Times New Roman"/>
-          <w:b w:val="0"/>
-          <w:i w:val="0"/>
-          <w:color w:val="000000"/>
-          <w:sz w:val="22"/>
-        </w:rPr>
-        <w:t>[5] Paul DuBois, 'MySQL Developer's Library', 5th Edition, Addison-Wesley Professional, 2013.</w:t>
-      </w:r>
-    </w:p>
-    <w:p>
-      <w:pPr>
-        <w:spacing w:after="160"/>
-        <w:ind w:left="576"/>
-      </w:pPr>
-      <w:r>
-        <w:rPr>
-          <w:rFonts w:ascii="Times New Roman" w:hAnsi="Times New Roman"/>
-          <w:b w:val="0"/>
-          <w:i w:val="0"/>
-          <w:color w:val="000000"/>
-          <w:sz w:val="22"/>
-        </w:rPr>
-        <w:t>[6] Loy, M., Eckstein, R., Wood, D., Elliott, J., &amp; Cole, B., 'Java Swing', 2nd Edition, O'Reilly Media, 2002.</w:t>
-      </w:r>
-    </w:p>
-    <w:p>
-      <w:r>
-        <w:rPr>
-          <w:rFonts w:ascii="Times New Roman" w:hAnsi="Times New Roman"/>
-          <w:b/>
-          <w:i w:val="0"/>
-          <w:color w:val="0A285F"/>
-          <w:sz w:val="32"/>
-        </w:rPr>
-        <w:br/>
-        <w:br/>
-        <w:t>10. Approval of the Project</w:t>
-        <w:br/>
-      </w:r>
-    </w:p>
-    <w:p>
-      <w:pPr>
-        <w:jc w:val="both"/>
-      </w:pPr>
-      <w:r>
-        <w:rPr>
-          <w:rFonts w:ascii="Times New Roman" w:hAnsi="Times New Roman"/>
-          <w:b w:val="0"/>
-          <w:i w:val="0"/>
-          <w:color w:val="000000"/>
-          <w:sz w:val="23"/>
-        </w:rPr>
-        <w:t>This is to certify that the project entitled 'MULTI-THREADED CLIENT-SERVER CHAT APPLICATION USING JAVA SOCKETS, SWING, AND MYSQL' submitted by Abhinav Batra (24EJCCA009), Amit Kumar (24EJCCA027), Anand Gaur (24EJCCA030), and Abhishek Sihag (24EJCCA012) in partial fulfillment for the award of the degree of Bachelor of Technology in Computer Science &amp; Engineering (Artificial Intelligence) at Jaipur Engineering College and Research Centre, Jaipur, affiliated with Rajasthan Technical University, Kota, is an authentic record of bonafide work carried out by them under my guidance and supervision.</w:t>
-        <w:br/>
-        <w:br/>
-        <w:t>To the best of my knowledge, the matter embodied in this project report has not been submitted to any other University / Institute for the award of any degree or diploma.</w:t>
-      </w:r>
-    </w:p>
-    <w:p/>
-    <w:p/>
-    <w:tbl>
-      <w:tblPr>
-        <w:tblW w:type="auto" w:w="0"/>
-        <w:jc w:val="center"/>
-        <w:tblLook w:firstColumn="1" w:firstRow="1" w:lastColumn="0" w:lastRow="0" w:noHBand="0" w:noVBand="1" w:val="04A0"/>
-      </w:tblPr>
-      <w:tblGrid>
-        <w:gridCol w:w="4824"/>
-        <w:gridCol w:w="4824"/>
-      </w:tblGrid>
-      <w:tr>
-        <w:tc>
-          <w:tcPr>
-            <w:tcW w:type="dxa" w:w="4608"/>
-          </w:tcPr>
-          <w:p>
-            <w:pPr>
-              <w:jc w:val="left"/>
-            </w:pPr>
-            <w:r>
-              <w:rPr>
-                <w:rFonts w:ascii="Times New Roman" w:hAnsi="Times New Roman"/>
-                <w:b/>
-                <w:i w:val="0"/>
-                <w:color w:val="000000"/>
-                <w:sz w:val="22"/>
-              </w:rPr>
-              <w:t>________________________</w:t>
-              <w:br/>
-              <w:t>Signature of Project Guide</w:t>
-              <w:br/>
-              <w:t>Ms. Mona Nagar</w:t>
-              <w:br/>
-              <w:t>Assistant Professor</w:t>
-              <w:br/>
-              <w:t>Dept. of CSE (AI)</w:t>
-            </w:r>
-          </w:p>
-        </w:tc>
-        <w:tc>
-          <w:tcPr>
-            <w:tcW w:type="dxa" w:w="4608"/>
-          </w:tcPr>
-          <w:p>
-            <w:pPr>
-              <w:jc w:val="right"/>
-            </w:pPr>
-            <w:r>
-              <w:rPr>
-                <w:rFonts w:ascii="Times New Roman" w:hAnsi="Times New Roman"/>
-                <w:b/>
-                <w:i w:val="0"/>
-                <w:color w:val="000000"/>
-                <w:sz w:val="22"/>
-              </w:rPr>
-              <w:t>________________________</w:t>
-              <w:br/>
-              <w:t>Signature of HOD</w:t>
-              <w:br/>
-              <w:t>Head of Department</w:t>
-              <w:br/>
-              <w:t>Dept. of CSE (AI)</w:t>
-            </w:r>
-          </w:p>
-        </w:tc>
-      </w:tr>
-    </w:tbl>
     <w:sectPr>
+      <w:headerReference w:type="default" r:id="rId9"/>
+      <w:footerReference w:type="default" r:id="rId10"/>
       <w:pgSz w:w="12240" w:h="15840"/>
-      <w:pgMar w:top="1296" w:right="1296" w:bottom="1296" w:left="1296" w:header="720" w:footer="720" w:gutter="0"/>
+      <w:pgMar w:top="1152" w:right="1296" w:bottom="1152" w:left="1296" w:header="720" w:footer="720" w:gutter="0"/>
       <w:cols w:space="720"/>
       <w:docGrid w:linePitch="360"/>
     </w:sectPr>
   </w:body>
 </w:document>
+</file>
+
+<file path=word/footer1.xml><?xml version="1.0" encoding="utf-8"?>
+<w:ftr xmlns:m="http://schemas.openxmlformats.org/officeDocument/2006/math" xmlns:mc="http://schemas.openxmlformats.org/markup-compatibility/2006" xmlns:mo="http://schemas.microsoft.com/office/mac/office/2008/main" xmlns:mv="urn:schemas-microsoft-com:mac:vml" xmlns:o="urn:schemas-microsoft-com:office:office" xmlns:r="http://schemas.openxmlformats.org/officeDocument/2006/relationships" xmlns:v="urn:schemas-microsoft-com:vml" xmlns:w10="urn:schemas-microsoft-com:office:word" xmlns:w14="http://schemas.microsoft.com/office/word/2010/wordml" xmlns:w="http://schemas.openxmlformats.org/wordprocessingml/2006/main" xmlns:wne="http://schemas.microsoft.com/office/word/2006/wordml" xmlns:wp14="http://schemas.microsoft.com/office/word/2010/wordprocessingDrawing" xmlns:wp="http://schemas.openxmlformats.org/drawingml/2006/wordprocessingDrawing" xmlns:wpc="http://schemas.microsoft.com/office/word/2010/wordprocessingCanvas" xmlns:wpg="http://schemas.microsoft.com/office/word/2010/wordprocessingGroup" xmlns:wpi="http://schemas.microsoft.com/office/word/2010/wordprocessingInk" xmlns:wps="http://schemas.microsoft.com/office/word/2010/wordprocessingShape" mc:Ignorable="w14 wp14">
+  <w:p>
+    <w:pPr>
+      <w:pStyle w:val="Footer"/>
+      <w:jc w:val="center"/>
+    </w:pPr>
+    <w:r>
+      <w:rPr>
+        <w:rFonts w:ascii="Segoe UI" w:hAnsi="Segoe UI"/>
+        <w:color w:val="94A3B8"/>
+        <w:sz w:val="17"/>
+      </w:rPr>
+      <w:t>Jaipur Engineering College and Research Centre (JECRC), Jaipur • Department of CSE (AI)</w:t>
+    </w:r>
+  </w:p>
+</w:ftr>
+</file>
+
+<file path=word/header1.xml><?xml version="1.0" encoding="utf-8"?>
+<w:hdr xmlns:m="http://schemas.openxmlformats.org/officeDocument/2006/math" xmlns:mc="http://schemas.openxmlformats.org/markup-compatibility/2006" xmlns:mo="http://schemas.microsoft.com/office/mac/office/2008/main" xmlns:mv="urn:schemas-microsoft-com:mac:vml" xmlns:o="urn:schemas-microsoft-com:office:office" xmlns:r="http://schemas.openxmlformats.org/officeDocument/2006/relationships" xmlns:v="urn:schemas-microsoft-com:vml" xmlns:w10="urn:schemas-microsoft-com:office:word" xmlns:w14="http://schemas.microsoft.com/office/word/2010/wordml" xmlns:w="http://schemas.openxmlformats.org/wordprocessingml/2006/main" xmlns:wne="http://schemas.microsoft.com/office/word/2006/wordml" xmlns:wp14="http://schemas.microsoft.com/office/word/2010/wordprocessingDrawing" xmlns:wp="http://schemas.openxmlformats.org/drawingml/2006/wordprocessingDrawing" xmlns:wpc="http://schemas.microsoft.com/office/word/2010/wordprocessingCanvas" xmlns:wpg="http://schemas.microsoft.com/office/word/2010/wordprocessingGroup" xmlns:wpi="http://schemas.microsoft.com/office/word/2010/wordprocessingInk" xmlns:wps="http://schemas.microsoft.com/office/word/2010/wordprocessingShape" mc:Ignorable="w14 wp14">
+  <w:p>
+    <w:pPr>
+      <w:pStyle w:val="Header"/>
+      <w:jc w:val="right"/>
+    </w:pPr>
+    <w:r>
+      <w:rPr>
+        <w:rFonts w:ascii="Segoe UI" w:hAnsi="Segoe UI"/>
+        <w:color w:val="94A3B8"/>
+        <w:sz w:val="17"/>
+      </w:rPr>
+      <w:t>JECRC StaffNet | Project Report</w:t>
+    </w:r>
+  </w:p>
+</w:hdr>
 </file>
 
 <file path=word/numbering.xml><?xml version="1.0" encoding="utf-8"?>

</xml_diff>

<commit_message>
Implement Department-isolated Notice Boards and Authority-governed Main Notice Board
</commit_message>
<xml_diff>
--- a/docs/Project_Report.docx
+++ b/docs/Project_Report.docx
@@ -38,7 +38,7 @@
           <w:color w:val="1E3A8A"/>
           <w:sz w:val="36"/>
         </w:rPr>
-        <w:t>JECRC StaffNet: Campus Intranet Faculty Information &amp; Official Circular Distribution System</w:t>
+        <w:t>JECRC StaffNet: Department-Isolated &amp; Central Circular Distribution System</w:t>
         <w:br/>
         <w:br/>
       </w:r>
@@ -341,7 +341,7 @@
           <w:color w:val="1E3A8A"/>
           <w:sz w:val="26"/>
         </w:rPr>
-        <w:t>Chapter 1: Executive Summary &amp; Project Motivation</w:t>
+        <w:t>Chapter 1: System Overview &amp; Institutional Need</w:t>
       </w:r>
     </w:p>
     <w:p>
@@ -354,7 +354,11 @@
           <w:color w:val="334155"/>
           <w:sz w:val="21"/>
         </w:rPr>
-        <w:t>Higher education environments thrive on timely and dependable information flow. Faculty coordination, exam invigilation, departmental reviews, and administrative notices demand high reliability. Traditional dependence on external messengers suffers from privacy concerns, message dilution, and internet vulnerabilities. JECRC StaffNet addresses this by establishing a high-performance, private campus intranet communication application developed natively using pure Java Standard Edition (JDK 25), TCP/IP Sockets, Swing GUI with HTML/CSS rendering, and MySQL 8.0 database persistence.</w:t>
+        <w:t>Modern academic governance requires strict separation of concerns between campus-wide administrative circulars and intradepartmental communications. JECRC StaffNet addresses this by establishing two distinct layers of communication:</w:t>
+        <w:br/>
+        <w:t>1. Main Campus Notice Board: Serves as the central digital gazette for the college. Only the Principal and Heads of Departments (HODs) are authorized to post broadcasts here. Faculty members across all departments access this channel in Read-Only mode to receive institutional directives.</w:t>
+        <w:br/>
+        <w:t>2. Department-Specific Notice Boards: Dynamically isolated according to the user's department (e.g., Information Technology, Computer Science &amp; AI). Only faculty belonging to that department can view and message on their departmental board.</w:t>
       </w:r>
     </w:p>
     <w:p>
@@ -365,7 +369,7 @@
           <w:color w:val="1E3A8A"/>
           <w:sz w:val="26"/>
         </w:rPr>
-        <w:t>Chapter 2: College Staff Domain Model &amp; Use Cases</w:t>
+        <w:t>Chapter 2: Authority &amp; Role-Based Access Control</w:t>
       </w:r>
     </w:p>
     <w:p>
@@ -378,25 +382,13 @@
           <w:color w:val="334155"/>
           <w:sz w:val="21"/>
         </w:rPr>
-        <w:t>The system provides dedicated features tailored to higher educational staff roles:</w:t>
+        <w:t>The system provides strict role-based authorization:</w:t>
         <w:br/>
-        <w:t>1. Role &amp; Designation Aware Directory: Displays staff with real-time designations (HOD, Assistant Professor, Exam Coordinator, Lab Incharge).</w:t>
+        <w:t>• Principal &amp; HODs: Authorized to broadcast on the Main Notice Board and their respective departmental boards.</w:t>
         <w:br/>
-        <w:t>2. Categorized Notice Dissemination: Staff can broadcast notices tagged as:</w:t>
+        <w:t>• Faculty (Professors, Associate &amp; Assistant Professors): Full messaging and document dispatch privileges on their Department Notice Board; read-only access to the Main Notice Board.</w:t>
         <w:br/>
-        <w:t xml:space="preserve">   • 🚨 Urgent Directive: Immediate compliance notices (red badge card)</w:t>
-        <w:br/>
-        <w:t xml:space="preserve">   • 📋 Meeting Notice / MoM: Academic council and departmental meetings (amber badge card)</w:t>
-        <w:br/>
-        <w:t xml:space="preserve">   • 📝 Exam Cell Notice: Mid-term/end-term duty rosters and invigilation slots (blue badge card)</w:t>
-        <w:br/>
-        <w:t xml:space="preserve">   • 🔬 Lab Infrastructure Notice: Computing hardware, software installations, and batch timings (green badge card)</w:t>
-        <w:br/>
-        <w:t xml:space="preserve">   • 📢 General Circular: Campus holidays, library timings, and academic circulars (indigo badge card)</w:t>
-        <w:br/>
-        <w:t>3. Confidential Staff Memos: Dedicated 1-to-1 secure private communication channels with pop-out window capabilities.</w:t>
-        <w:br/>
-        <w:t>4. Academic Document Sharing: Direct transfer of PDF circulars, PPT seminar presentations, Word duty rosters, and Excel grade registers directly over socket streams without third-party cloud dependence.</w:t>
+        <w:t>• Examination Cell &amp; Lab Coordinators: Dedicated departmental notice channels for duty rosters, marks verification, and lab maintenance.</w:t>
       </w:r>
     </w:p>
     <w:p>
@@ -407,7 +399,7 @@
           <w:color w:val="1E3A8A"/>
           <w:sz w:val="26"/>
         </w:rPr>
-        <w:t>Chapter 3: Technical Architecture &amp; Core Java Concepts</w:t>
+        <w:t>Chapter 3: Technical Implementation &amp; Core Java API</w:t>
       </w:r>
     </w:p>
     <w:p>
@@ -420,15 +412,15 @@
           <w:color w:val="334155"/>
           <w:sz w:val="21"/>
         </w:rPr>
-        <w:t>The project satisfies the rigorous curriculum standards of the Advanced Java Laboratory:</w:t>
+        <w:t>The project fulfills the core Advanced Java curriculum:</w:t>
         <w:br/>
-        <w:t>• java.net.ServerSocket &amp; Socket: Low-level TCP streaming on port 12345. Non-blocking character I/O streams configured with UTF-8 encoding.</w:t>
+        <w:t>• Socket Programming: java.net.ServerSocket listening on TCP port 12345. Custom protocol dispatches messages according to departmental boundaries.</w:t>
         <w:br/>
-        <w:t>• Concurrency &amp; Thread Pooling: Dynamic thread management using java.util.concurrent.ExecutorService. ConcurrentHashMap guarantees race-condition free client session lookups.</w:t>
+        <w:t>• Multithreading &amp; Thread Pooling: Dynamic thread pooling using java.util.concurrent.ExecutorService with ConcurrentHashMap session management.</w:t>
         <w:br/>
-        <w:t>• Java Swing &amp; HTML/CSS Rendering: Embedded JEditorPane rendering real-time CSS speech cards and alert badges on the Event Dispatch Thread (SwingUtilities.invokeLater).</w:t>
+        <w:t>• Swing GUI &amp; HTML/CSS: Presentation-grade notice card rendering in JEditorPane, supporting alert banners for Urgent Directives, Meeting Notices (MoM), and Exam Duties.</w:t>
         <w:br/>
-        <w:t>• JDBC &amp; MySQL 8.0: Externalized db.properties credential loading, SHA-256 password hashing via java.security.MessageDigest, and PreparedStatements for SQL injection prevention.</w:t>
+        <w:t>• JDBC &amp; MySQL 8.0: Externalized db.properties, SHA-256 password hashing, and partitioned query filtering (WHERE receiver = 'MAIN' OR receiver = 'DEPT:&lt;userDept&gt;').</w:t>
       </w:r>
     </w:p>
     <w:p>
@@ -439,7 +431,7 @@
           <w:color w:val="1E3A8A"/>
           <w:sz w:val="26"/>
         </w:rPr>
-        <w:t>Chapter 4: Offline Intranet Security &amp; Reliability</w:t>
+        <w:t>Chapter 4: Offline Intranet Security</w:t>
       </w:r>
     </w:p>
     <w:p>
@@ -452,31 +444,7 @@
           <w:color w:val="334155"/>
           <w:sz w:val="21"/>
         </w:rPr>
-        <w:t>A key pedagogical and operational achievement of JECRC StaffNet is complete offline resilience. All socket packets travel either over localhost (127.0.0.1) or across the campus Local Area Network (LAN/WLAN). The MySQL database runs locally, and file transfers are encoded via Base64 binary streams directly into the local downloads/ directory. This ensures total data sovereignty, zero dependence on telecom gateways, and immunity to internet failures during critical exam periods.</w:t>
-      </w:r>
-    </w:p>
-    <w:p>
-      <w:r>
-        <w:rPr>
-          <w:rFonts w:ascii="Segoe UI" w:hAnsi="Segoe UI"/>
-          <w:b/>
-          <w:color w:val="1E3A8A"/>
-          <w:sz w:val="26"/>
-        </w:rPr>
-        <w:t>Chapter 5: Conclusion &amp; Future Scope</w:t>
-      </w:r>
-    </w:p>
-    <w:p>
-      <w:pPr>
-        <w:spacing w:line="276" w:lineRule="auto"/>
-      </w:pPr>
-      <w:r>
-        <w:rPr>
-          <w:rFonts w:ascii="Segoe UI" w:hAnsi="Segoe UI"/>
-          <w:color w:val="334155"/>
-          <w:sz w:val="21"/>
-        </w:rPr>
-        <w:t>JECRC StaffNet successfully delivers an institution-grade, secure, and intuitive staff communication platform. Future iterations may include departmental sub-channels, biometric authentication integration, and digital signatures for official college circulars.</w:t>
+        <w:t>JECRC StaffNet functions entirely without external internet. All network communication travels across the college LAN or localhost, guaranteeing 100% data privacy and zero dependence on commercial cloud platforms.</w:t>
       </w:r>
     </w:p>
     <w:sectPr>

</xml_diff>

<commit_message>
Update Project Report and Synopsis with Ms. Shivani Laddha guide and new StaffNet screenshots
</commit_message>
<xml_diff>
--- a/docs/Project_Report.docx
+++ b/docs/Project_Report.docx
@@ -4,55 +4,110 @@
   <w:body>
     <w:p>
       <w:pPr>
+        <w:spacing w:after="40"/>
         <w:jc w:val="center"/>
       </w:pPr>
       <w:r>
         <w:rPr>
-          <w:rFonts w:ascii="Segoe UI" w:hAnsi="Segoe UI"/>
+          <w:rFonts w:ascii="Times New Roman" w:hAnsi="Times New Roman"/>
           <w:b/>
-          <w:color w:val="475569"/>
-          <w:sz w:val="24"/>
+          <w:i w:val="0"/>
+          <w:color w:val="000000"/>
+          <w:sz w:val="30"/>
         </w:rPr>
-        <w:t>JAIPUR ENGINEERING COLLEGE AND RESEARCH CENTRE</w:t>
+        <w:t>A</w:t>
         <w:br/>
-        <w:t>DEPARTMENT OF COMPUTER SCIENCE &amp; ENGINEERING (AI)</w:t>
+      </w:r>
+      <w:r>
+        <w:rPr>
+          <w:rFonts w:ascii="Times New Roman" w:hAnsi="Times New Roman"/>
+          <w:b/>
+          <w:i w:val="0"/>
+          <w:color w:val="000000"/>
+          <w:sz w:val="34"/>
+        </w:rPr>
+        <w:t>Project Report</w:t>
+        <w:br/>
+        <w:t>On</w:t>
+        <w:br/>
+      </w:r>
+      <w:r>
+        <w:rPr>
+          <w:rFonts w:ascii="Times New Roman" w:hAnsi="Times New Roman"/>
+          <w:b/>
+          <w:i w:val="0"/>
+          <w:color w:val="0A285F"/>
+          <w:sz w:val="30"/>
+        </w:rPr>
+        <w:t>MULTI-THREADED CLIENT-SERVER CHAT APPLICATION USING JAVA SOCKETS, SWING, AND MYSQL</w:t>
         <w:br/>
         <w:br/>
       </w:r>
       <w:r>
         <w:rPr>
-          <w:rFonts w:ascii="Segoe UI" w:hAnsi="Segoe UI"/>
-          <w:b/>
-          <w:color w:val="64748B"/>
-          <w:sz w:val="28"/>
+          <w:rFonts w:ascii="Times New Roman" w:hAnsi="Times New Roman"/>
+          <w:b w:val="0"/>
+          <w:i/>
+          <w:color w:val="000000"/>
+          <w:sz w:val="23"/>
         </w:rPr>
-        <w:t>PROJECT REPORT</w:t>
-        <w:br/>
-        <w:t>ON</w:t>
+        <w:t>Submitted in partial fulfillment for the award of degree of</w:t>
         <w:br/>
       </w:r>
       <w:r>
         <w:rPr>
-          <w:rFonts w:ascii="Segoe UI" w:hAnsi="Segoe UI"/>
+          <w:rFonts w:ascii="Times New Roman" w:hAnsi="Times New Roman"/>
           <w:b/>
-          <w:color w:val="1E3A8A"/>
-          <w:sz w:val="36"/>
+          <w:i w:val="0"/>
+          <w:color w:val="000000"/>
+          <w:sz w:val="27"/>
         </w:rPr>
-        <w:t>JECRC StaffNet: Department-Isolated &amp; Central Circular Distribution System</w:t>
+        <w:t>Bachelor of Technology</w:t>
+        <w:br/>
+      </w:r>
+      <w:r>
+        <w:rPr>
+          <w:rFonts w:ascii="Times New Roman" w:hAnsi="Times New Roman"/>
+          <w:b w:val="0"/>
+          <w:i/>
+          <w:color w:val="000000"/>
+          <w:sz w:val="23"/>
+        </w:rPr>
+        <w:t>Degree Of</w:t>
+        <w:br/>
+      </w:r>
+      <w:r>
+        <w:rPr>
+          <w:rFonts w:ascii="Times New Roman" w:hAnsi="Times New Roman"/>
+          <w:b/>
+          <w:i w:val="0"/>
+          <w:color w:val="000000"/>
+          <w:sz w:val="27"/>
+        </w:rPr>
+        <w:t>Rajasthan Technical University, KOTA</w:t>
         <w:br/>
         <w:br/>
       </w:r>
       <w:r>
         <w:rPr>
-          <w:rFonts w:ascii="Segoe UI" w:hAnsi="Segoe UI"/>
-          <w:color w:val="475569"/>
-          <w:sz w:val="22"/>
+          <w:rFonts w:ascii="Times New Roman" w:hAnsi="Times New Roman"/>
+          <w:b/>
+          <w:i w:val="0"/>
+          <w:color w:val="0A285F"/>
+          <w:sz w:val="27"/>
         </w:rPr>
-        <w:t>Submitted in partial fulfillment of the requirements for</w:t>
+        <w:t>JAIPUR ENGINEERING COLLEGE AND RESEARCH CENTRE</w:t>
         <w:br/>
-        <w:t>Advanced Java Lab (B.Tech 3rd Year CSE-AI)</w:t>
-        <w:br/>
-        <w:t>Rajasthan Technical University (RTU), Kota</w:t>
+      </w:r>
+      <w:r>
+        <w:rPr>
+          <w:rFonts w:ascii="Times New Roman" w:hAnsi="Times New Roman"/>
+          <w:b/>
+          <w:i w:val="0"/>
+          <w:color w:val="000000"/>
+          <w:sz w:val="25"/>
+        </w:rPr>
+        <w:t>2026-2027</w:t>
         <w:br/>
         <w:br/>
       </w:r>
@@ -61,247 +116,83 @@
       <w:tblPr>
         <w:tblW w:type="auto" w:w="0"/>
         <w:jc w:val="center"/>
+        <w:tblLayout w:type="fixed"/>
         <w:tblLook w:firstColumn="1" w:firstRow="1" w:lastColumn="0" w:lastRow="0" w:noHBand="0" w:noVBand="1" w:val="04A0"/>
       </w:tblPr>
       <w:tblGrid>
-        <w:gridCol w:w="3216"/>
-        <w:gridCol w:w="3216"/>
-        <w:gridCol w:w="3216"/>
+        <w:gridCol w:w="4824"/>
+        <w:gridCol w:w="4824"/>
       </w:tblGrid>
       <w:tr>
         <w:tc>
           <w:tcPr>
-            <w:tcW w:type="dxa" w:w="3216"/>
-            <w:shd w:fill="1E3A8A"/>
+            <w:tcW w:type="dxa" w:w="4752"/>
           </w:tcPr>
           <w:p>
+            <w:pPr>
+              <w:jc w:val="left"/>
+            </w:pPr>
             <w:r>
               <w:rPr>
-                <w:rFonts w:ascii="Segoe UI" w:hAnsi="Segoe UI"/>
+                <w:rFonts w:ascii="Times New Roman" w:hAnsi="Times New Roman"/>
                 <w:b/>
-                <w:color w:val="FFFFFF"/>
+                <w:i w:val="0"/>
+                <w:color w:val="000000"/>
+                <w:sz w:val="23"/>
               </w:rPr>
-              <w:t>Roll Number</w:t>
+              <w:t>Submitted By:</w:t>
+              <w:br/>
+            </w:r>
+            <w:r>
+              <w:rPr>
+                <w:rFonts w:ascii="Times New Roman" w:hAnsi="Times New Roman"/>
+                <w:b w:val="0"/>
+                <w:i w:val="0"/>
+                <w:color w:val="000000"/>
+                <w:sz w:val="22"/>
+              </w:rPr>
+              <w:t>Abhinav Batra (24EJCCA009)</w:t>
+              <w:br/>
+              <w:t>Amit Kumar (24EJCCA027)</w:t>
+              <w:br/>
+              <w:t>Anand Gaur (24EJCCA030)</w:t>
+              <w:br/>
+              <w:t>Abhishek Sihag (24EJCCA012)</w:t>
             </w:r>
           </w:p>
         </w:tc>
         <w:tc>
           <w:tcPr>
-            <w:tcW w:type="dxa" w:w="3216"/>
-            <w:shd w:fill="1E3A8A"/>
+            <w:tcW w:type="dxa" w:w="4464"/>
           </w:tcPr>
           <w:p>
+            <w:pPr>
+              <w:jc w:val="right"/>
+            </w:pPr>
             <w:r>
               <w:rPr>
-                <w:rFonts w:ascii="Segoe UI" w:hAnsi="Segoe UI"/>
+                <w:rFonts w:ascii="Times New Roman" w:hAnsi="Times New Roman"/>
                 <w:b/>
-                <w:color w:val="FFFFFF"/>
+                <w:i w:val="0"/>
+                <w:color w:val="000000"/>
+                <w:sz w:val="23"/>
               </w:rPr>
-              <w:t>Submitted By</w:t>
+              <w:t>Project Guide:</w:t>
+              <w:br/>
             </w:r>
-          </w:p>
-        </w:tc>
-        <w:tc>
-          <w:tcPr>
-            <w:tcW w:type="dxa" w:w="3216"/>
-            <w:shd w:fill="1E3A8A"/>
-          </w:tcPr>
-          <w:p>
             <w:r>
               <w:rPr>
-                <w:rFonts w:ascii="Segoe UI" w:hAnsi="Segoe UI"/>
-                <w:b/>
-                <w:color w:val="FFFFFF"/>
+                <w:rFonts w:ascii="Times New Roman" w:hAnsi="Times New Roman"/>
+                <w:b w:val="0"/>
+                <w:i w:val="0"/>
+                <w:color w:val="000000"/>
+                <w:sz w:val="22"/>
               </w:rPr>
-              <w:t>Department &amp; Semester</w:t>
-            </w:r>
-          </w:p>
-        </w:tc>
-      </w:tr>
-      <w:tr>
-        <w:tc>
-          <w:tcPr>
-            <w:tcW w:type="dxa" w:w="3216"/>
-            <w:shd w:fill="F8FAFC"/>
-          </w:tcPr>
-          <w:p>
-            <w:r>
-              <w:rPr>
-                <w:rFonts w:ascii="Segoe UI" w:hAnsi="Segoe UI"/>
-                <w:sz w:val="19"/>
-              </w:rPr>
-              <w:t>24EJCCA009</w:t>
-            </w:r>
-          </w:p>
-        </w:tc>
-        <w:tc>
-          <w:tcPr>
-            <w:tcW w:type="dxa" w:w="3216"/>
-            <w:shd w:fill="F8FAFC"/>
-          </w:tcPr>
-          <w:p>
-            <w:r>
-              <w:rPr>
-                <w:rFonts w:ascii="Segoe UI" w:hAnsi="Segoe UI"/>
-                <w:sz w:val="19"/>
-              </w:rPr>
-              <w:t>Abhinav Batra</w:t>
-            </w:r>
-          </w:p>
-        </w:tc>
-        <w:tc>
-          <w:tcPr>
-            <w:tcW w:type="dxa" w:w="3216"/>
-            <w:shd w:fill="F8FAFC"/>
-          </w:tcPr>
-          <w:p>
-            <w:r>
-              <w:rPr>
-                <w:rFonts w:ascii="Segoe UI" w:hAnsi="Segoe UI"/>
-                <w:sz w:val="19"/>
-              </w:rPr>
-              <w:t>B.Tech CSE (AI) • 5th Semester</w:t>
-            </w:r>
-          </w:p>
-        </w:tc>
-      </w:tr>
-      <w:tr>
-        <w:tc>
-          <w:tcPr>
-            <w:tcW w:type="dxa" w:w="3216"/>
-            <w:shd w:fill="FFFFFF"/>
-          </w:tcPr>
-          <w:p>
-            <w:r>
-              <w:rPr>
-                <w:rFonts w:ascii="Segoe UI" w:hAnsi="Segoe UI"/>
-                <w:sz w:val="19"/>
-              </w:rPr>
-              <w:t>24EJCCA027</w:t>
-            </w:r>
-          </w:p>
-        </w:tc>
-        <w:tc>
-          <w:tcPr>
-            <w:tcW w:type="dxa" w:w="3216"/>
-            <w:shd w:fill="FFFFFF"/>
-          </w:tcPr>
-          <w:p>
-            <w:r>
-              <w:rPr>
-                <w:rFonts w:ascii="Segoe UI" w:hAnsi="Segoe UI"/>
-                <w:sz w:val="19"/>
-              </w:rPr>
-              <w:t>Amit Kumar</w:t>
-            </w:r>
-          </w:p>
-        </w:tc>
-        <w:tc>
-          <w:tcPr>
-            <w:tcW w:type="dxa" w:w="3216"/>
-            <w:shd w:fill="FFFFFF"/>
-          </w:tcPr>
-          <w:p>
-            <w:r>
-              <w:rPr>
-                <w:rFonts w:ascii="Segoe UI" w:hAnsi="Segoe UI"/>
-                <w:sz w:val="19"/>
-              </w:rPr>
-              <w:t>B.Tech CSE (AI) • 5th Semester</w:t>
-            </w:r>
-          </w:p>
-        </w:tc>
-      </w:tr>
-      <w:tr>
-        <w:tc>
-          <w:tcPr>
-            <w:tcW w:type="dxa" w:w="3216"/>
-            <w:shd w:fill="F8FAFC"/>
-          </w:tcPr>
-          <w:p>
-            <w:r>
-              <w:rPr>
-                <w:rFonts w:ascii="Segoe UI" w:hAnsi="Segoe UI"/>
-                <w:sz w:val="19"/>
-              </w:rPr>
-              <w:t>24EJCCA030</w:t>
-            </w:r>
-          </w:p>
-        </w:tc>
-        <w:tc>
-          <w:tcPr>
-            <w:tcW w:type="dxa" w:w="3216"/>
-            <w:shd w:fill="F8FAFC"/>
-          </w:tcPr>
-          <w:p>
-            <w:r>
-              <w:rPr>
-                <w:rFonts w:ascii="Segoe UI" w:hAnsi="Segoe UI"/>
-                <w:sz w:val="19"/>
-              </w:rPr>
-              <w:t>Anand Gaur</w:t>
-            </w:r>
-          </w:p>
-        </w:tc>
-        <w:tc>
-          <w:tcPr>
-            <w:tcW w:type="dxa" w:w="3216"/>
-            <w:shd w:fill="F8FAFC"/>
-          </w:tcPr>
-          <w:p>
-            <w:r>
-              <w:rPr>
-                <w:rFonts w:ascii="Segoe UI" w:hAnsi="Segoe UI"/>
-                <w:sz w:val="19"/>
-              </w:rPr>
-              <w:t>B.Tech CSE (AI) • 5th Semester</w:t>
-            </w:r>
-          </w:p>
-        </w:tc>
-      </w:tr>
-      <w:tr>
-        <w:tc>
-          <w:tcPr>
-            <w:tcW w:type="dxa" w:w="3216"/>
-            <w:shd w:fill="FFFFFF"/>
-          </w:tcPr>
-          <w:p>
-            <w:r>
-              <w:rPr>
-                <w:rFonts w:ascii="Segoe UI" w:hAnsi="Segoe UI"/>
-                <w:sz w:val="19"/>
-              </w:rPr>
-              <w:t>24EJCCA012</w:t>
-            </w:r>
-          </w:p>
-        </w:tc>
-        <w:tc>
-          <w:tcPr>
-            <w:tcW w:type="dxa" w:w="3216"/>
-            <w:shd w:fill="FFFFFF"/>
-          </w:tcPr>
-          <w:p>
-            <w:r>
-              <w:rPr>
-                <w:rFonts w:ascii="Segoe UI" w:hAnsi="Segoe UI"/>
-                <w:sz w:val="19"/>
-              </w:rPr>
-              <w:t>Abhishek Sihag</w:t>
-            </w:r>
-          </w:p>
-        </w:tc>
-        <w:tc>
-          <w:tcPr>
-            <w:tcW w:type="dxa" w:w="3216"/>
-            <w:shd w:fill="FFFFFF"/>
-          </w:tcPr>
-          <w:p>
-            <w:r>
-              <w:rPr>
-                <w:rFonts w:ascii="Segoe UI" w:hAnsi="Segoe UI"/>
-                <w:sz w:val="19"/>
-              </w:rPr>
-              <w:t>B.Tech CSE (AI) • 5th Semester</w:t>
+              <w:t>Ms. Shivani Laddha</w:t>
+              <w:br/>
+              <w:t>Assistant Professor</w:t>
+              <w:br/>
+              <w:t>Dept. of CSE (AI)</w:t>
             </w:r>
           </w:p>
         </w:tc>
@@ -314,18 +205,535 @@
       </w:pPr>
       <w:r>
         <w:rPr>
-          <w:rFonts w:ascii="Segoe UI" w:hAnsi="Segoe UI"/>
+          <w:rFonts w:ascii="Times New Roman" w:hAnsi="Times New Roman"/>
           <w:b/>
-          <w:color w:val="1E3A8A"/>
-          <w:sz w:val="22"/>
+          <w:i w:val="0"/>
+          <w:color w:val="0A285F"/>
+          <w:sz w:val="23"/>
         </w:rPr>
-        <w:t>Under the Guidance of:</w:t>
+        <w:t>DEPARTMENT OF</w:t>
         <w:br/>
-        <w:t>Ms. Mona Nagar</w:t>
+        <w:t>COMPUTER SCIENCE &amp; ENGINEERING (ARTIFICIAL INTELLIGENCE)</w:t>
         <w:br/>
-        <w:t>Assistant Professor, Department of Computer Science &amp; Engineering</w:t>
+      </w:r>
+      <w:r>
+        <w:rPr>
+          <w:rFonts w:ascii="Times New Roman" w:hAnsi="Times New Roman"/>
+          <w:b/>
+          <w:i w:val="0"/>
+          <w:color w:val="000000"/>
+          <w:sz w:val="23"/>
+        </w:rPr>
+        <w:t>JAIPUR ENGINEERING COLLEGE AND RESEARCH CENTRE</w:t>
         <w:br/>
-        <w:t>JECRC, Jaipur</w:t>
+      </w:r>
+      <w:r>
+        <w:rPr>
+          <w:rFonts w:ascii="Times New Roman" w:hAnsi="Times New Roman"/>
+          <w:b w:val="0"/>
+          <w:i/>
+          <w:color w:val="000000"/>
+          <w:sz w:val="19"/>
+        </w:rPr>
+        <w:t>Shri Ram ki Nangal, via Sitapura RIICO, Tonk Road, Sukhpuria, Bambala, Jaipur, Rajasthan</w:t>
+      </w:r>
+    </w:p>
+    <w:p>
+      <w:r>
+        <w:br w:type="page"/>
+      </w:r>
+    </w:p>
+    <w:p>
+      <w:pPr>
+        <w:jc w:val="center"/>
+      </w:pPr>
+      <w:r>
+        <w:rPr>
+          <w:rFonts w:ascii="Times New Roman" w:hAnsi="Times New Roman"/>
+          <w:b/>
+          <w:i w:val="0"/>
+          <w:color w:val="0A285F"/>
+          <w:sz w:val="36"/>
+        </w:rPr>
+        <w:t>TABLE OF CONTENTS</w:t>
+        <w:br/>
+      </w:r>
+    </w:p>
+    <w:tbl>
+      <w:tblPr>
+        <w:tblW w:type="auto" w:w="0"/>
+        <w:jc w:val="center"/>
+        <w:tblLayout w:type="fixed"/>
+        <w:tblLook w:firstColumn="1" w:firstRow="1" w:lastColumn="0" w:lastRow="0" w:noHBand="0" w:noVBand="1" w:val="04A0"/>
+      </w:tblPr>
+      <w:tblGrid>
+        <w:gridCol w:w="4824"/>
+        <w:gridCol w:w="4824"/>
+      </w:tblGrid>
+      <w:tr>
+        <w:tc>
+          <w:tcPr>
+            <w:tcW w:type="dxa" w:w="7920"/>
+          </w:tcPr>
+          <w:p>
+            <w:r>
+              <w:rPr>
+                <w:rFonts w:ascii="Times New Roman" w:hAnsi="Times New Roman"/>
+                <w:b w:val="0"/>
+                <w:i w:val="0"/>
+                <w:color w:val="000000"/>
+                <w:sz w:val="24"/>
+              </w:rPr>
+              <w:t>Introduction ..............................................</w:t>
+            </w:r>
+          </w:p>
+        </w:tc>
+        <w:tc>
+          <w:tcPr>
+            <w:tcW w:type="dxa" w:w="1440"/>
+          </w:tcPr>
+          <w:p>
+            <w:pPr>
+              <w:jc w:val="right"/>
+            </w:pPr>
+            <w:r>
+              <w:rPr>
+                <w:rFonts w:ascii="Times New Roman" w:hAnsi="Times New Roman"/>
+                <w:b/>
+                <w:i w:val="0"/>
+                <w:color w:val="000000"/>
+                <w:sz w:val="24"/>
+              </w:rPr>
+              <w:t>1</w:t>
+            </w:r>
+          </w:p>
+        </w:tc>
+      </w:tr>
+      <w:tr>
+        <w:tc>
+          <w:tcPr>
+            <w:tcW w:type="dxa" w:w="7920"/>
+          </w:tcPr>
+          <w:p>
+            <w:r>
+              <w:rPr>
+                <w:rFonts w:ascii="Times New Roman" w:hAnsi="Times New Roman"/>
+                <w:b w:val="0"/>
+                <w:i w:val="0"/>
+                <w:color w:val="000000"/>
+                <w:sz w:val="24"/>
+              </w:rPr>
+              <w:t>Objective .................................................</w:t>
+            </w:r>
+          </w:p>
+        </w:tc>
+        <w:tc>
+          <w:tcPr>
+            <w:tcW w:type="dxa" w:w="1440"/>
+          </w:tcPr>
+          <w:p>
+            <w:pPr>
+              <w:jc w:val="right"/>
+            </w:pPr>
+            <w:r>
+              <w:rPr>
+                <w:rFonts w:ascii="Times New Roman" w:hAnsi="Times New Roman"/>
+                <w:b/>
+                <w:i w:val="0"/>
+                <w:color w:val="000000"/>
+                <w:sz w:val="24"/>
+              </w:rPr>
+              <w:t>2</w:t>
+            </w:r>
+          </w:p>
+        </w:tc>
+      </w:tr>
+      <w:tr>
+        <w:tc>
+          <w:tcPr>
+            <w:tcW w:type="dxa" w:w="7920"/>
+          </w:tcPr>
+          <w:p>
+            <w:r>
+              <w:rPr>
+                <w:rFonts w:ascii="Times New Roman" w:hAnsi="Times New Roman"/>
+                <w:b w:val="0"/>
+                <w:i w:val="0"/>
+                <w:color w:val="000000"/>
+                <w:sz w:val="24"/>
+              </w:rPr>
+              <w:t>Methodology And Planning ..................................</w:t>
+            </w:r>
+          </w:p>
+        </w:tc>
+        <w:tc>
+          <w:tcPr>
+            <w:tcW w:type="dxa" w:w="1440"/>
+          </w:tcPr>
+          <w:p>
+            <w:pPr>
+              <w:jc w:val="right"/>
+            </w:pPr>
+            <w:r>
+              <w:rPr>
+                <w:rFonts w:ascii="Times New Roman" w:hAnsi="Times New Roman"/>
+                <w:b/>
+                <w:i w:val="0"/>
+                <w:color w:val="000000"/>
+                <w:sz w:val="24"/>
+              </w:rPr>
+              <w:t>3</w:t>
+            </w:r>
+          </w:p>
+        </w:tc>
+      </w:tr>
+      <w:tr>
+        <w:tc>
+          <w:tcPr>
+            <w:tcW w:type="dxa" w:w="7920"/>
+          </w:tcPr>
+          <w:p>
+            <w:r>
+              <w:rPr>
+                <w:rFonts w:ascii="Times New Roman" w:hAnsi="Times New Roman"/>
+                <w:b w:val="0"/>
+                <w:i w:val="0"/>
+                <w:color w:val="000000"/>
+                <w:sz w:val="24"/>
+              </w:rPr>
+              <w:t>Literature Review .........................................</w:t>
+            </w:r>
+          </w:p>
+        </w:tc>
+        <w:tc>
+          <w:tcPr>
+            <w:tcW w:type="dxa" w:w="1440"/>
+          </w:tcPr>
+          <w:p>
+            <w:pPr>
+              <w:jc w:val="right"/>
+            </w:pPr>
+            <w:r>
+              <w:rPr>
+                <w:rFonts w:ascii="Times New Roman" w:hAnsi="Times New Roman"/>
+                <w:b/>
+                <w:i w:val="0"/>
+                <w:color w:val="000000"/>
+                <w:sz w:val="24"/>
+              </w:rPr>
+              <w:t>4</w:t>
+            </w:r>
+          </w:p>
+        </w:tc>
+      </w:tr>
+      <w:tr>
+        <w:tc>
+          <w:tcPr>
+            <w:tcW w:type="dxa" w:w="7920"/>
+          </w:tcPr>
+          <w:p>
+            <w:r>
+              <w:rPr>
+                <w:rFonts w:ascii="Times New Roman" w:hAnsi="Times New Roman"/>
+                <w:b w:val="0"/>
+                <w:i w:val="0"/>
+                <w:color w:val="000000"/>
+                <w:sz w:val="24"/>
+              </w:rPr>
+              <w:t>Applications of the Project ...............................</w:t>
+            </w:r>
+          </w:p>
+        </w:tc>
+        <w:tc>
+          <w:tcPr>
+            <w:tcW w:type="dxa" w:w="1440"/>
+          </w:tcPr>
+          <w:p>
+            <w:pPr>
+              <w:jc w:val="right"/>
+            </w:pPr>
+            <w:r>
+              <w:rPr>
+                <w:rFonts w:ascii="Times New Roman" w:hAnsi="Times New Roman"/>
+                <w:b/>
+                <w:i w:val="0"/>
+                <w:color w:val="000000"/>
+                <w:sz w:val="24"/>
+              </w:rPr>
+              <w:t>5</w:t>
+            </w:r>
+          </w:p>
+        </w:tc>
+      </w:tr>
+      <w:tr>
+        <w:tc>
+          <w:tcPr>
+            <w:tcW w:type="dxa" w:w="7920"/>
+          </w:tcPr>
+          <w:p>
+            <w:r>
+              <w:rPr>
+                <w:rFonts w:ascii="Times New Roman" w:hAnsi="Times New Roman"/>
+                <w:b w:val="0"/>
+                <w:i w:val="0"/>
+                <w:color w:val="000000"/>
+                <w:sz w:val="24"/>
+              </w:rPr>
+              <w:t>Block Diagram .............................................</w:t>
+            </w:r>
+          </w:p>
+        </w:tc>
+        <w:tc>
+          <w:tcPr>
+            <w:tcW w:type="dxa" w:w="1440"/>
+          </w:tcPr>
+          <w:p>
+            <w:pPr>
+              <w:jc w:val="right"/>
+            </w:pPr>
+            <w:r>
+              <w:rPr>
+                <w:rFonts w:ascii="Times New Roman" w:hAnsi="Times New Roman"/>
+                <w:b/>
+                <w:i w:val="0"/>
+                <w:color w:val="000000"/>
+                <w:sz w:val="24"/>
+              </w:rPr>
+              <w:t>6</w:t>
+            </w:r>
+          </w:p>
+        </w:tc>
+      </w:tr>
+      <w:tr>
+        <w:tc>
+          <w:tcPr>
+            <w:tcW w:type="dxa" w:w="7920"/>
+          </w:tcPr>
+          <w:p>
+            <w:r>
+              <w:rPr>
+                <w:rFonts w:ascii="Times New Roman" w:hAnsi="Times New Roman"/>
+                <w:b w:val="0"/>
+                <w:i w:val="0"/>
+                <w:color w:val="000000"/>
+                <w:sz w:val="24"/>
+              </w:rPr>
+              <w:t>UML Diagram ...............................................</w:t>
+            </w:r>
+          </w:p>
+        </w:tc>
+        <w:tc>
+          <w:tcPr>
+            <w:tcW w:type="dxa" w:w="1440"/>
+          </w:tcPr>
+          <w:p>
+            <w:pPr>
+              <w:jc w:val="right"/>
+            </w:pPr>
+            <w:r>
+              <w:rPr>
+                <w:rFonts w:ascii="Times New Roman" w:hAnsi="Times New Roman"/>
+                <w:b/>
+                <w:i w:val="0"/>
+                <w:color w:val="000000"/>
+                <w:sz w:val="24"/>
+              </w:rPr>
+              <w:t>7</w:t>
+            </w:r>
+          </w:p>
+        </w:tc>
+      </w:tr>
+      <w:tr>
+        <w:tc>
+          <w:tcPr>
+            <w:tcW w:type="dxa" w:w="7920"/>
+          </w:tcPr>
+          <w:p>
+            <w:r>
+              <w:rPr>
+                <w:rFonts w:ascii="Times New Roman" w:hAnsi="Times New Roman"/>
+                <w:b w:val="0"/>
+                <w:i w:val="0"/>
+                <w:color w:val="000000"/>
+                <w:sz w:val="24"/>
+              </w:rPr>
+              <w:t>Screenshots ...............................................</w:t>
+            </w:r>
+          </w:p>
+        </w:tc>
+        <w:tc>
+          <w:tcPr>
+            <w:tcW w:type="dxa" w:w="1440"/>
+          </w:tcPr>
+          <w:p>
+            <w:pPr>
+              <w:jc w:val="right"/>
+            </w:pPr>
+            <w:r>
+              <w:rPr>
+                <w:rFonts w:ascii="Times New Roman" w:hAnsi="Times New Roman"/>
+                <w:b/>
+                <w:i w:val="0"/>
+                <w:color w:val="000000"/>
+                <w:sz w:val="24"/>
+              </w:rPr>
+              <w:t>8</w:t>
+            </w:r>
+          </w:p>
+        </w:tc>
+      </w:tr>
+      <w:tr>
+        <w:tc>
+          <w:tcPr>
+            <w:tcW w:type="dxa" w:w="7920"/>
+          </w:tcPr>
+          <w:p>
+            <w:r>
+              <w:rPr>
+                <w:rFonts w:ascii="Times New Roman" w:hAnsi="Times New Roman"/>
+                <w:b w:val="0"/>
+                <w:i w:val="0"/>
+                <w:color w:val="000000"/>
+                <w:sz w:val="24"/>
+              </w:rPr>
+              <w:t>References ................................................</w:t>
+            </w:r>
+          </w:p>
+        </w:tc>
+        <w:tc>
+          <w:tcPr>
+            <w:tcW w:type="dxa" w:w="1440"/>
+          </w:tcPr>
+          <w:p>
+            <w:pPr>
+              <w:jc w:val="right"/>
+            </w:pPr>
+            <w:r>
+              <w:rPr>
+                <w:rFonts w:ascii="Times New Roman" w:hAnsi="Times New Roman"/>
+                <w:b/>
+                <w:i w:val="0"/>
+                <w:color w:val="000000"/>
+                <w:sz w:val="24"/>
+              </w:rPr>
+              <w:t>9</w:t>
+            </w:r>
+          </w:p>
+        </w:tc>
+      </w:tr>
+      <w:tr>
+        <w:tc>
+          <w:tcPr>
+            <w:tcW w:type="dxa" w:w="7920"/>
+          </w:tcPr>
+          <w:p>
+            <w:r>
+              <w:rPr>
+                <w:rFonts w:ascii="Times New Roman" w:hAnsi="Times New Roman"/>
+                <w:b w:val="0"/>
+                <w:i w:val="0"/>
+                <w:color w:val="000000"/>
+                <w:sz w:val="24"/>
+              </w:rPr>
+              <w:t>Approval of the Project ...................................</w:t>
+            </w:r>
+          </w:p>
+        </w:tc>
+        <w:tc>
+          <w:tcPr>
+            <w:tcW w:type="dxa" w:w="1440"/>
+          </w:tcPr>
+          <w:p>
+            <w:pPr>
+              <w:jc w:val="right"/>
+            </w:pPr>
+            <w:r>
+              <w:rPr>
+                <w:rFonts w:ascii="Times New Roman" w:hAnsi="Times New Roman"/>
+                <w:b/>
+                <w:i w:val="0"/>
+                <w:color w:val="000000"/>
+                <w:sz w:val="24"/>
+              </w:rPr>
+              <w:t>10</w:t>
+            </w:r>
+          </w:p>
+        </w:tc>
+      </w:tr>
+    </w:tbl>
+    <w:p>
+      <w:r>
+        <w:br w:type="page"/>
+      </w:r>
+    </w:p>
+    <w:p>
+      <w:r>
+        <w:rPr>
+          <w:rFonts w:ascii="Times New Roman" w:hAnsi="Times New Roman"/>
+          <w:b/>
+          <w:i w:val="0"/>
+          <w:color w:val="0A285F"/>
+          <w:sz w:val="32"/>
+        </w:rPr>
+        <w:t>1. Introduction</w:t>
+        <w:br/>
+      </w:r>
+    </w:p>
+    <w:p>
+      <w:pPr>
+        <w:jc w:val="both"/>
+      </w:pPr>
+      <w:r>
+        <w:rPr>
+          <w:rFonts w:ascii="Times New Roman" w:hAnsi="Times New Roman"/>
+          <w:b w:val="0"/>
+          <w:i w:val="0"/>
+          <w:color w:val="000000"/>
+          <w:sz w:val="23"/>
+        </w:rPr>
+        <w:t>In the contemporary computing era, distributed applications and networked real-time communication systems are vital for organizational collaboration. This project, titled 'Multi-Threaded Client-Server Chat Application', implements a comprehensive, multi-user communication environment programmed in pure Core Java (JDK 25). The system utilizes reliable transport-layer TCP/IP sockets via java.net, high-throughput worker thread management via java.util.concurrent.ExecutorService, an interactive Swing Graphical User Interface, and persistent relational data storage using MySQL 8.0 and JDBC.</w:t>
+        <w:br/>
+        <w:br/>
+        <w:t>The project is architected to address standard challenges in networked desktop applications, including thread exhaustion, UI freezes caused by blocking I/O, secure credential storage, and synchronized real-time client presence.</w:t>
+      </w:r>
+    </w:p>
+    <w:p>
+      <w:r>
+        <w:rPr>
+          <w:rFonts w:ascii="Times New Roman" w:hAnsi="Times New Roman"/>
+          <w:b/>
+          <w:i w:val="0"/>
+          <w:color w:val="0A285F"/>
+          <w:sz w:val="32"/>
+        </w:rPr>
+        <w:br/>
+        <w:t>2. Objective</w:t>
+        <w:br/>
+      </w:r>
+    </w:p>
+    <w:p>
+      <w:pPr>
+        <w:jc w:val="both"/>
+      </w:pPr>
+      <w:r>
+        <w:rPr>
+          <w:rFonts w:ascii="Times New Roman" w:hAnsi="Times New Roman"/>
+          <w:b w:val="0"/>
+          <w:i w:val="0"/>
+          <w:color w:val="000000"/>
+          <w:sz w:val="23"/>
+        </w:rPr>
+        <w:t>The primary objectives of this project are:</w:t>
+        <w:br/>
+        <w:t>1. Concurrency Management: Build a multi-threaded server using ExecutorService thread pooling that dynamically handles multiple simultaneous client connections.</w:t>
+        <w:br/>
+        <w:t>2. Bi-directional Messaging: Provide both global broadcast messaging (all active users) and private point-to-point messaging (1-to-1 dialogue).</w:t>
+        <w:br/>
+        <w:t>3. Real-Time Presence Detection: Maintain an accurate, synchronized active contacts roster with live status updates upon client connection or disconnection.</w:t>
+        <w:br/>
+        <w:t>4. Robust Persistence &amp; Security: Authenticate users against a MySQL database using SHA-256 password hashing, preventing SQL injection via JDBC PreparedStatements, and load past chat history upon login.</w:t>
+        <w:br/>
+        <w:t>5. Fluid GUI Architecture: Design a non-blocking Swing GUI where network I/O operations are strictly segregated from the Event Dispatch Thread (EDT).</w:t>
       </w:r>
     </w:p>
     <w:p>
@@ -336,165 +744,614 @@
     <w:p>
       <w:r>
         <w:rPr>
-          <w:rFonts w:ascii="Segoe UI" w:hAnsi="Segoe UI"/>
+          <w:rFonts w:ascii="Times New Roman" w:hAnsi="Times New Roman"/>
           <w:b/>
-          <w:color w:val="1E3A8A"/>
-          <w:sz w:val="26"/>
+          <w:i w:val="0"/>
+          <w:color w:val="0A285F"/>
+          <w:sz w:val="32"/>
         </w:rPr>
-        <w:t>Chapter 1: System Overview &amp; Institutional Need</w:t>
+        <w:t>3. Methodology And Planning</w:t>
+        <w:br/>
       </w:r>
     </w:p>
     <w:p>
       <w:pPr>
-        <w:spacing w:line="276" w:lineRule="auto"/>
+        <w:jc w:val="both"/>
       </w:pPr>
       <w:r>
         <w:rPr>
-          <w:rFonts w:ascii="Segoe UI" w:hAnsi="Segoe UI"/>
-          <w:color w:val="334155"/>
-          <w:sz w:val="21"/>
+          <w:rFonts w:ascii="Times New Roman" w:hAnsi="Times New Roman"/>
+          <w:b w:val="0"/>
+          <w:i w:val="0"/>
+          <w:color w:val="000000"/>
+          <w:sz w:val="23"/>
         </w:rPr>
-        <w:t>Modern academic governance requires strict separation of concerns between campus-wide administrative circulars and intradepartmental communications. JECRC StaffNet addresses this by establishing two distinct layers of communication:</w:t>
+        <w:t>The development methodology followed an iterative, component-driven engineering model divided into four distinct phases:</w:t>
         <w:br/>
-        <w:t>1. Main Campus Notice Board: Serves as the central digital gazette for the college. Only the Principal and Heads of Departments (HODs) are authorized to post broadcasts here. Faculty members across all departments access this channel in Read-Only mode to receive institutional directives.</w:t>
         <w:br/>
-        <w:t>2. Department-Specific Notice Boards: Dynamically isolated according to the user's department (e.g., Information Technology, Computer Science &amp; AI). Only faculty belonging to that department can view and message on their departmental board.</w:t>
+        <w:t>Phase 1 - Database Schema &amp; Persistence Layer:</w:t>
+        <w:br/>
+        <w:t>Designed the relational schema consisting of 'users' and 'messages' tables in MySQL. Implemented DBHandler.java using standard JDBC. PreparedStatements were utilized to parameterize all queries, and MessageDigest was applied to compute 64-character SHA-256 password hashes.</w:t>
+        <w:br/>
+        <w:br/>
+        <w:t>Phase 2 - Network Protocol &amp; Server Engineering:</w:t>
+        <w:br/>
+        <w:t>Formulated a clean, deterministic pipe-delimited application layer protocol (e.g., LOGIN|&lt;user&gt;|&lt;pass&gt;, BROADCAST|&lt;msg&gt;, PRIVATE|&lt;rcpt&gt;|&lt;msg&gt;). Engineered ChatServer.java with a ServerSocket listening on TCP port 12345, utilizing Executors.newCachedThreadPool() to assign ClientHandler runnables dynamically. Client sessions are stored thread-safely in a ConcurrentHashMap.</w:t>
+        <w:br/>
+        <w:br/>
+        <w:t>Phase 3 - Client Networking &amp; GUI Construction:</w:t>
+        <w:br/>
+        <w:t>Developed ChatClient.java with a dedicated background thread to read inbound socket data. Constructed ChatGUI.java using Java Swing (CardLayout, JTextPane, JList). Applied SwingUtilities.invokeLater() to ensure thread-safe updates to the UI.</w:t>
+        <w:br/>
+        <w:br/>
+        <w:t>Phase 4 - System Integration &amp; Verification:</w:t>
+        <w:br/>
+        <w:t>Conducted end-to-end integration tests using JDK 25 and MySQL 8.0, verifying concurrent logins, message delivery latency, and clean resource deallocation on window closing events.</w:t>
       </w:r>
     </w:p>
     <w:p>
       <w:r>
         <w:rPr>
-          <w:rFonts w:ascii="Segoe UI" w:hAnsi="Segoe UI"/>
+          <w:rFonts w:ascii="Times New Roman" w:hAnsi="Times New Roman"/>
           <w:b/>
-          <w:color w:val="1E3A8A"/>
-          <w:sz w:val="26"/>
+          <w:i w:val="0"/>
+          <w:color w:val="0A285F"/>
+          <w:sz w:val="32"/>
         </w:rPr>
-        <w:t>Chapter 2: Authority &amp; Role-Based Access Control</w:t>
+        <w:br/>
+        <w:t>4. Literature Review</w:t>
+        <w:br/>
       </w:r>
     </w:p>
     <w:p>
       <w:pPr>
-        <w:spacing w:line="276" w:lineRule="auto"/>
+        <w:jc w:val="both"/>
       </w:pPr>
       <w:r>
         <w:rPr>
-          <w:rFonts w:ascii="Segoe UI" w:hAnsi="Segoe UI"/>
-          <w:color w:val="334155"/>
-          <w:sz w:val="21"/>
+          <w:rFonts w:ascii="Times New Roman" w:hAnsi="Times New Roman"/>
+          <w:b w:val="0"/>
+          <w:i w:val="0"/>
+          <w:color w:val="000000"/>
+          <w:sz w:val="23"/>
         </w:rPr>
-        <w:t>The system provides strict role-based authorization:</w:t>
-        <w:br/>
-        <w:t>• Principal &amp; HODs: Authorized to broadcast on the Main Notice Board and their respective departmental boards.</w:t>
-        <w:br/>
-        <w:t>• Faculty (Professors, Associate &amp; Assistant Professors): Full messaging and document dispatch privileges on their Department Notice Board; read-only access to the Main Notice Board.</w:t>
-        <w:br/>
-        <w:t>• Examination Cell &amp; Lab Coordinators: Dedicated departmental notice channels for duty rosters, marks verification, and lab maintenance.</w:t>
+        <w:t>Distributed messaging architectures have evolved from early monolithic, synchronous systems to event-driven and multi-threaded paradigms. Harold (2014) highlights that traditional single-threaded socket architectures create severe I/O bottlenecks when scaling beyond minimal client counts, advocating for thread pooling mechanisms that reuse operating system threads rather than instantiating unbounded threads per connection. Goetz et al. (2006) discuss concurrent synchronization primitives, noting that ConcurrentHashMap achieves high concurrency through lock-free reads and granular write locks, which is ideal for server-side active user registries. Furthermore, Schildt (2021) emphasizes that graphical desktop frameworks like Swing follow a single-thread rule where all visual mutations must occur on the Event Dispatch Thread (EDT) to avert deadlock and race conditions. This project synthesizes these established paradigms to construct a production-quality, educational client-server framework.</w:t>
+      </w:r>
+    </w:p>
+    <w:p>
+      <w:r>
+        <w:br w:type="page"/>
       </w:r>
     </w:p>
     <w:p>
       <w:r>
         <w:rPr>
-          <w:rFonts w:ascii="Segoe UI" w:hAnsi="Segoe UI"/>
+          <w:rFonts w:ascii="Times New Roman" w:hAnsi="Times New Roman"/>
           <w:b/>
-          <w:color w:val="1E3A8A"/>
-          <w:sz w:val="26"/>
+          <w:i w:val="0"/>
+          <w:color w:val="0A285F"/>
+          <w:sz w:val="32"/>
         </w:rPr>
-        <w:t>Chapter 3: Technical Implementation &amp; Core Java API</w:t>
+        <w:t>5. Applications of the Project</w:t>
+        <w:br/>
       </w:r>
     </w:p>
     <w:p>
       <w:pPr>
-        <w:spacing w:line="276" w:lineRule="auto"/>
+        <w:jc w:val="both"/>
       </w:pPr>
       <w:r>
         <w:rPr>
-          <w:rFonts w:ascii="Segoe UI" w:hAnsi="Segoe UI"/>
-          <w:color w:val="334155"/>
-          <w:sz w:val="21"/>
+          <w:rFonts w:ascii="Times New Roman" w:hAnsi="Times New Roman"/>
+          <w:b w:val="0"/>
+          <w:i w:val="0"/>
+          <w:color w:val="000000"/>
+          <w:sz w:val="23"/>
         </w:rPr>
-        <w:t>The project fulfills the core Advanced Java curriculum:</w:t>
+        <w:t>1. Academic &amp; Institutional Intranets: Provides private, secure, local-network messaging for computer science laboratories and campus faculties.</w:t>
         <w:br/>
-        <w:t>• Socket Programming: java.net.ServerSocket listening on TCP port 12345. Custom protocol dispatches messages according to departmental boundaries.</w:t>
+        <w:t>2. Corporate Internal Chat: Serves as a standalone, internal communication tool that operates without reliance on external cloud servers, preserving company data sovereignty.</w:t>
         <w:br/>
-        <w:t>• Multithreading &amp; Thread Pooling: Dynamic thread pooling using java.util.concurrent.ExecutorService with ConcurrentHashMap session management.</w:t>
+        <w:t>3. Real-Time Customer Support Systems: The underlying multi-threaded socket and routing infrastructure can be extended to customer assistance desks for immediate agent-client interactions.</w:t>
         <w:br/>
-        <w:t>• Swing GUI &amp; HTML/CSS: Presentation-grade notice card rendering in JEditorPane, supporting alert banners for Urgent Directives, Meeting Notices (MoM), and Exam Duties.</w:t>
-        <w:br/>
-        <w:t>• JDBC &amp; MySQL 8.0: Externalized db.properties, SHA-256 password hashing, and partitioned query filtering (WHERE receiver = 'MAIN' OR receiver = 'DEPT:&lt;userDept&gt;').</w:t>
+        <w:t>4. Modular Foundation for Distributed Systems: Acts as a foundational framework for distributed computing labs, illustrating advanced synchronization, socket state machines, and relational storage.</w:t>
       </w:r>
     </w:p>
     <w:p>
       <w:r>
         <w:rPr>
-          <w:rFonts w:ascii="Segoe UI" w:hAnsi="Segoe UI"/>
+          <w:rFonts w:ascii="Times New Roman" w:hAnsi="Times New Roman"/>
           <w:b/>
-          <w:color w:val="1E3A8A"/>
-          <w:sz w:val="26"/>
+          <w:i w:val="0"/>
+          <w:color w:val="0A285F"/>
+          <w:sz w:val="32"/>
         </w:rPr>
-        <w:t>Chapter 4: Offline Intranet Security</w:t>
+        <w:br/>
+        <w:t>6. Block Diagram</w:t>
+        <w:br/>
       </w:r>
     </w:p>
     <w:p>
       <w:pPr>
-        <w:spacing w:line="276" w:lineRule="auto"/>
+        <w:jc w:val="center"/>
+      </w:pPr>
+    </w:p>
+    <w:p>
+      <w:r>
+        <w:drawing>
+          <wp:inline xmlns:a="http://schemas.openxmlformats.org/drawingml/2006/main" xmlns:pic="http://schemas.openxmlformats.org/drawingml/2006/picture">
+            <wp:extent cx="5486400" cy="3271876"/>
+            <wp:docPr id="1" name="Picture 1"/>
+            <wp:cNvGraphicFramePr>
+              <a:graphicFrameLocks noChangeAspect="1"/>
+            </wp:cNvGraphicFramePr>
+            <a:graphic>
+              <a:graphicData uri="http://schemas.openxmlformats.org/drawingml/2006/picture">
+                <pic:pic>
+                  <pic:nvPicPr>
+                    <pic:cNvPr id="0" name="block_diagram.png"/>
+                    <pic:cNvPicPr/>
+                  </pic:nvPicPr>
+                  <pic:blipFill>
+                    <a:blip r:embed="rId9"/>
+                    <a:stretch>
+                      <a:fillRect/>
+                    </a:stretch>
+                  </pic:blipFill>
+                  <pic:spPr>
+                    <a:xfrm>
+                      <a:off x="0" y="0"/>
+                      <a:ext cx="5486400" cy="3271876"/>
+                    </a:xfrm>
+                    <a:prstGeom prst="rect"/>
+                  </pic:spPr>
+                </pic:pic>
+              </a:graphicData>
+            </a:graphic>
+          </wp:inline>
+        </w:drawing>
+      </w:r>
+    </w:p>
+    <w:p>
+      <w:pPr>
+        <w:jc w:val="center"/>
       </w:pPr>
       <w:r>
         <w:rPr>
-          <w:rFonts w:ascii="Segoe UI" w:hAnsi="Segoe UI"/>
-          <w:color w:val="334155"/>
-          <w:sz w:val="21"/>
+          <w:rFonts w:ascii="Times New Roman" w:hAnsi="Times New Roman"/>
+          <w:b w:val="0"/>
+          <w:i/>
+          <w:color w:val="000000"/>
+          <w:sz w:val="20"/>
         </w:rPr>
-        <w:t>JECRC StaffNet functions entirely without external internet. All network communication travels across the college LAN or localhost, guaranteeing 100% data privacy and zero dependence on commercial cloud platforms.</w:t>
+        <w:t>Figure 6.1: High-Level System Architecture and Component Interfacing</w:t>
       </w:r>
     </w:p>
+    <w:p>
+      <w:r>
+        <w:br w:type="page"/>
+      </w:r>
+    </w:p>
+    <w:p>
+      <w:r>
+        <w:rPr>
+          <w:rFonts w:ascii="Times New Roman" w:hAnsi="Times New Roman"/>
+          <w:b/>
+          <w:i w:val="0"/>
+          <w:color w:val="0A285F"/>
+          <w:sz w:val="32"/>
+        </w:rPr>
+        <w:t>7. UML Diagram</w:t>
+        <w:br/>
+      </w:r>
+    </w:p>
+    <w:p>
+      <w:pPr>
+        <w:jc w:val="center"/>
+      </w:pPr>
+    </w:p>
+    <w:p>
+      <w:r>
+        <w:drawing>
+          <wp:inline xmlns:a="http://schemas.openxmlformats.org/drawingml/2006/main" xmlns:pic="http://schemas.openxmlformats.org/drawingml/2006/picture">
+            <wp:extent cx="5669280" cy="3588810"/>
+            <wp:docPr id="2" name="Picture 2"/>
+            <wp:cNvGraphicFramePr>
+              <a:graphicFrameLocks noChangeAspect="1"/>
+            </wp:cNvGraphicFramePr>
+            <a:graphic>
+              <a:graphicData uri="http://schemas.openxmlformats.org/drawingml/2006/picture">
+                <pic:pic>
+                  <pic:nvPicPr>
+                    <pic:cNvPr id="0" name="uml_diagram.png"/>
+                    <pic:cNvPicPr/>
+                  </pic:nvPicPr>
+                  <pic:blipFill>
+                    <a:blip r:embed="rId10"/>
+                    <a:stretch>
+                      <a:fillRect/>
+                    </a:stretch>
+                  </pic:blipFill>
+                  <pic:spPr>
+                    <a:xfrm>
+                      <a:off x="0" y="0"/>
+                      <a:ext cx="5669280" cy="3588810"/>
+                    </a:xfrm>
+                    <a:prstGeom prst="rect"/>
+                  </pic:spPr>
+                </pic:pic>
+              </a:graphicData>
+            </a:graphic>
+          </wp:inline>
+        </w:drawing>
+      </w:r>
+    </w:p>
+    <w:p>
+      <w:pPr>
+        <w:jc w:val="center"/>
+      </w:pPr>
+      <w:r>
+        <w:rPr>
+          <w:rFonts w:ascii="Times New Roman" w:hAnsi="Times New Roman"/>
+          <w:b w:val="0"/>
+          <w:i/>
+          <w:color w:val="000000"/>
+          <w:sz w:val="20"/>
+        </w:rPr>
+        <w:t>Figure 7.1: UML Class Diagram Depicting Classes, Methods, and Inter-Object Associations</w:t>
+      </w:r>
+    </w:p>
+    <w:p>
+      <w:r>
+        <w:rPr>
+          <w:rFonts w:ascii="Times New Roman" w:hAnsi="Times New Roman"/>
+          <w:b/>
+          <w:i w:val="0"/>
+          <w:color w:val="0A285F"/>
+          <w:sz w:val="32"/>
+        </w:rPr>
+        <w:br/>
+        <w:t>8. Screenshots</w:t>
+        <w:br/>
+      </w:r>
+    </w:p>
+    <w:p>
+      <w:pPr>
+        <w:jc w:val="center"/>
+      </w:pPr>
+    </w:p>
+    <w:p>
+      <w:r>
+        <w:drawing>
+          <wp:inline xmlns:a="http://schemas.openxmlformats.org/drawingml/2006/main" xmlns:pic="http://schemas.openxmlformats.org/drawingml/2006/picture">
+            <wp:extent cx="5029200" cy="5327884"/>
+            <wp:docPr id="3" name="Picture 3"/>
+            <wp:cNvGraphicFramePr>
+              <a:graphicFrameLocks noChangeAspect="1"/>
+            </wp:cNvGraphicFramePr>
+            <a:graphic>
+              <a:graphicData uri="http://schemas.openxmlformats.org/drawingml/2006/picture">
+                <pic:pic>
+                  <pic:nvPicPr>
+                    <pic:cNvPr id="0" name="login_screenshot.png"/>
+                    <pic:cNvPicPr/>
+                  </pic:nvPicPr>
+                  <pic:blipFill>
+                    <a:blip r:embed="rId11"/>
+                    <a:stretch>
+                      <a:fillRect/>
+                    </a:stretch>
+                  </pic:blipFill>
+                  <pic:spPr>
+                    <a:xfrm>
+                      <a:off x="0" y="0"/>
+                      <a:ext cx="5029200" cy="5327884"/>
+                    </a:xfrm>
+                    <a:prstGeom prst="rect"/>
+                  </pic:spPr>
+                </pic:pic>
+              </a:graphicData>
+            </a:graphic>
+          </wp:inline>
+        </w:drawing>
+      </w:r>
+    </w:p>
+    <w:p>
+      <w:pPr>
+        <w:jc w:val="center"/>
+      </w:pPr>
+      <w:r>
+        <w:rPr>
+          <w:rFonts w:ascii="Times New Roman" w:hAnsi="Times New Roman"/>
+          <w:b w:val="0"/>
+          <w:i/>
+          <w:color w:val="000000"/>
+          <w:sz w:val="20"/>
+        </w:rPr>
+        <w:t>Figure 8.1: Swing Graphical User Interface - Authentication Screen (Login &amp; Registration)</w:t>
+      </w:r>
+    </w:p>
+    <w:p>
+      <w:pPr>
+        <w:spacing w:before="240"/>
+        <w:jc w:val="center"/>
+      </w:pPr>
+    </w:p>
+    <w:p>
+      <w:r>
+        <w:drawing>
+          <wp:inline xmlns:a="http://schemas.openxmlformats.org/drawingml/2006/main" xmlns:pic="http://schemas.openxmlformats.org/drawingml/2006/picture">
+            <wp:extent cx="5486400" cy="2903934"/>
+            <wp:docPr id="4" name="Picture 4"/>
+            <wp:cNvGraphicFramePr>
+              <a:graphicFrameLocks noChangeAspect="1"/>
+            </wp:cNvGraphicFramePr>
+            <a:graphic>
+              <a:graphicData uri="http://schemas.openxmlformats.org/drawingml/2006/picture">
+                <pic:pic>
+                  <pic:nvPicPr>
+                    <pic:cNvPr id="0" name="staffnet_dashboard.png"/>
+                    <pic:cNvPicPr/>
+                  </pic:nvPicPr>
+                  <pic:blipFill>
+                    <a:blip r:embed="rId12"/>
+                    <a:stretch>
+                      <a:fillRect/>
+                    </a:stretch>
+                  </pic:blipFill>
+                  <pic:spPr>
+                    <a:xfrm>
+                      <a:off x="0" y="0"/>
+                      <a:ext cx="5486400" cy="2903934"/>
+                    </a:xfrm>
+                    <a:prstGeom prst="rect"/>
+                  </pic:spPr>
+                </pic:pic>
+              </a:graphicData>
+            </a:graphic>
+          </wp:inline>
+        </w:drawing>
+      </w:r>
+    </w:p>
+    <w:p>
+      <w:pPr>
+        <w:jc w:val="center"/>
+      </w:pPr>
+      <w:r>
+        <w:rPr>
+          <w:rFonts w:ascii="Times New Roman" w:hAnsi="Times New Roman"/>
+          <w:b w:val="0"/>
+          <w:i/>
+          <w:color w:val="000000"/>
+          <w:sz w:val="20"/>
+        </w:rPr>
+        <w:t>Figure 8.2: JECRC StaffNet Multi-Channel Dashboard &amp; Live Staff Directory</w:t>
+      </w:r>
+    </w:p>
+    <w:p>
+      <w:r>
+        <w:br w:type="page"/>
+      </w:r>
+    </w:p>
+    <w:p>
+      <w:r>
+        <w:rPr>
+          <w:rFonts w:ascii="Times New Roman" w:hAnsi="Times New Roman"/>
+          <w:b/>
+          <w:i w:val="0"/>
+          <w:color w:val="0A285F"/>
+          <w:sz w:val="32"/>
+        </w:rPr>
+        <w:t>9. References</w:t>
+        <w:br/>
+      </w:r>
+    </w:p>
+    <w:p>
+      <w:pPr>
+        <w:spacing w:after="160"/>
+        <w:ind w:left="576"/>
+      </w:pPr>
+      <w:r>
+        <w:rPr>
+          <w:rFonts w:ascii="Times New Roman" w:hAnsi="Times New Roman"/>
+          <w:b w:val="0"/>
+          <w:i w:val="0"/>
+          <w:color w:val="000000"/>
+          <w:sz w:val="22"/>
+        </w:rPr>
+        <w:t>[1] Herbert Schildt, 'Java: The Complete Reference', 12th Edition, McGraw-Hill Education, 2021.</w:t>
+      </w:r>
+    </w:p>
+    <w:p>
+      <w:pPr>
+        <w:spacing w:after="160"/>
+        <w:ind w:left="576"/>
+      </w:pPr>
+      <w:r>
+        <w:rPr>
+          <w:rFonts w:ascii="Times New Roman" w:hAnsi="Times New Roman"/>
+          <w:b w:val="0"/>
+          <w:i w:val="0"/>
+          <w:color w:val="000000"/>
+          <w:sz w:val="22"/>
+        </w:rPr>
+        <w:t>[2] Elliotte Rusty Harold, 'Java Network Programming: Developing Networked Applications', 4th Edition, O'Reilly Media, 2014.</w:t>
+      </w:r>
+    </w:p>
+    <w:p>
+      <w:pPr>
+        <w:spacing w:after="160"/>
+        <w:ind w:left="576"/>
+      </w:pPr>
+      <w:r>
+        <w:rPr>
+          <w:rFonts w:ascii="Times New Roman" w:hAnsi="Times New Roman"/>
+          <w:b w:val="0"/>
+          <w:i w:val="0"/>
+          <w:color w:val="000000"/>
+          <w:sz w:val="22"/>
+        </w:rPr>
+        <w:t>[3] Brian Goetz, Tim Peierls, Joshua Bloch, Joseph Bowbeer, David Holmes, Doug Lea, 'Java Concurrency in Practice', Addison-Wesley Professional, 2006.</w:t>
+      </w:r>
+    </w:p>
+    <w:p>
+      <w:pPr>
+        <w:spacing w:after="160"/>
+        <w:ind w:left="576"/>
+      </w:pPr>
+      <w:r>
+        <w:rPr>
+          <w:rFonts w:ascii="Times New Roman" w:hAnsi="Times New Roman"/>
+          <w:b w:val="0"/>
+          <w:i w:val="0"/>
+          <w:color w:val="000000"/>
+          <w:sz w:val="22"/>
+        </w:rPr>
+        <w:t>[4] Oracle Corporation, 'Java Platform, Standard Edition Documentation - Socket, ServerSocket &amp; Concurrency Utilities', Oracle Technology Network.</w:t>
+      </w:r>
+    </w:p>
+    <w:p>
+      <w:pPr>
+        <w:spacing w:after="160"/>
+        <w:ind w:left="576"/>
+      </w:pPr>
+      <w:r>
+        <w:rPr>
+          <w:rFonts w:ascii="Times New Roman" w:hAnsi="Times New Roman"/>
+          <w:b w:val="0"/>
+          <w:i w:val="0"/>
+          <w:color w:val="000000"/>
+          <w:sz w:val="22"/>
+        </w:rPr>
+        <w:t>[5] Paul DuBois, 'MySQL Developer's Library', 5th Edition, Addison-Wesley Professional, 2013.</w:t>
+      </w:r>
+    </w:p>
+    <w:p>
+      <w:pPr>
+        <w:spacing w:after="160"/>
+        <w:ind w:left="576"/>
+      </w:pPr>
+      <w:r>
+        <w:rPr>
+          <w:rFonts w:ascii="Times New Roman" w:hAnsi="Times New Roman"/>
+          <w:b w:val="0"/>
+          <w:i w:val="0"/>
+          <w:color w:val="000000"/>
+          <w:sz w:val="22"/>
+        </w:rPr>
+        <w:t>[6] Loy, M., Eckstein, R., Wood, D., Elliott, J., &amp; Cole, B., 'Java Swing', 2nd Edition, O'Reilly Media, 2002.</w:t>
+      </w:r>
+    </w:p>
+    <w:p>
+      <w:r>
+        <w:rPr>
+          <w:rFonts w:ascii="Times New Roman" w:hAnsi="Times New Roman"/>
+          <w:b/>
+          <w:i w:val="0"/>
+          <w:color w:val="0A285F"/>
+          <w:sz w:val="32"/>
+        </w:rPr>
+        <w:br/>
+        <w:br/>
+        <w:t>10. Approval of the Project</w:t>
+        <w:br/>
+      </w:r>
+    </w:p>
+    <w:p>
+      <w:pPr>
+        <w:jc w:val="both"/>
+      </w:pPr>
+      <w:r>
+        <w:rPr>
+          <w:rFonts w:ascii="Times New Roman" w:hAnsi="Times New Roman"/>
+          <w:b w:val="0"/>
+          <w:i w:val="0"/>
+          <w:color w:val="000000"/>
+          <w:sz w:val="23"/>
+        </w:rPr>
+        <w:t>This is to certify that the project entitled 'MULTI-THREADED CLIENT-SERVER CHAT APPLICATION USING JAVA SOCKETS, SWING, AND MYSQL' submitted by Abhinav Batra (24EJCCA009), Amit Kumar (24EJCCA027), Anand Gaur (24EJCCA030), and Abhishek Sihag (24EJCCA012) in partial fulfillment for the award of the degree of Bachelor of Technology in Computer Science &amp; Engineering (Artificial Intelligence) at Jaipur Engineering College and Research Centre, Jaipur, affiliated with Rajasthan Technical University, Kota, is an authentic record of bonafide work carried out by them under my guidance and supervision.</w:t>
+        <w:br/>
+        <w:br/>
+        <w:t>To the best of my knowledge, the matter embodied in this project report has not been submitted to any other University / Institute for the award of any degree or diploma.</w:t>
+      </w:r>
+    </w:p>
+    <w:p/>
+    <w:p/>
+    <w:tbl>
+      <w:tblPr>
+        <w:tblW w:type="auto" w:w="0"/>
+        <w:jc w:val="center"/>
+        <w:tblLook w:firstColumn="1" w:firstRow="1" w:lastColumn="0" w:lastRow="0" w:noHBand="0" w:noVBand="1" w:val="04A0"/>
+      </w:tblPr>
+      <w:tblGrid>
+        <w:gridCol w:w="4824"/>
+        <w:gridCol w:w="4824"/>
+      </w:tblGrid>
+      <w:tr>
+        <w:tc>
+          <w:tcPr>
+            <w:tcW w:type="dxa" w:w="4608"/>
+          </w:tcPr>
+          <w:p>
+            <w:pPr>
+              <w:jc w:val="left"/>
+            </w:pPr>
+            <w:r>
+              <w:rPr>
+                <w:rFonts w:ascii="Times New Roman" w:hAnsi="Times New Roman"/>
+                <w:b/>
+                <w:i w:val="0"/>
+                <w:color w:val="000000"/>
+                <w:sz w:val="22"/>
+              </w:rPr>
+              <w:t>________________________</w:t>
+              <w:br/>
+              <w:t>Signature of Project Guide</w:t>
+              <w:br/>
+              <w:t>Ms. Shivani Laddha</w:t>
+              <w:br/>
+              <w:t>Assistant Professor</w:t>
+              <w:br/>
+              <w:t>Dept. of CSE (AI)</w:t>
+            </w:r>
+          </w:p>
+        </w:tc>
+        <w:tc>
+          <w:tcPr>
+            <w:tcW w:type="dxa" w:w="4608"/>
+          </w:tcPr>
+          <w:p>
+            <w:pPr>
+              <w:jc w:val="right"/>
+            </w:pPr>
+            <w:r>
+              <w:rPr>
+                <w:rFonts w:ascii="Times New Roman" w:hAnsi="Times New Roman"/>
+                <w:b/>
+                <w:i w:val="0"/>
+                <w:color w:val="000000"/>
+                <w:sz w:val="22"/>
+              </w:rPr>
+              <w:t>________________________</w:t>
+              <w:br/>
+              <w:t>Signature of HOD</w:t>
+              <w:br/>
+              <w:t>Head of Department</w:t>
+              <w:br/>
+              <w:t>Dept. of CSE (AI)</w:t>
+            </w:r>
+          </w:p>
+        </w:tc>
+      </w:tr>
+    </w:tbl>
     <w:sectPr>
-      <w:headerReference w:type="default" r:id="rId9"/>
-      <w:footerReference w:type="default" r:id="rId10"/>
       <w:pgSz w:w="12240" w:h="15840"/>
-      <w:pgMar w:top="1152" w:right="1296" w:bottom="1152" w:left="1296" w:header="720" w:footer="720" w:gutter="0"/>
+      <w:pgMar w:top="1296" w:right="1296" w:bottom="1296" w:left="1296" w:header="720" w:footer="720" w:gutter="0"/>
       <w:cols w:space="720"/>
       <w:docGrid w:linePitch="360"/>
     </w:sectPr>
   </w:body>
 </w:document>
-</file>
-
-<file path=word/footer1.xml><?xml version="1.0" encoding="utf-8"?>
-<w:ftr xmlns:m="http://schemas.openxmlformats.org/officeDocument/2006/math" xmlns:mc="http://schemas.openxmlformats.org/markup-compatibility/2006" xmlns:mo="http://schemas.microsoft.com/office/mac/office/2008/main" xmlns:mv="urn:schemas-microsoft-com:mac:vml" xmlns:o="urn:schemas-microsoft-com:office:office" xmlns:r="http://schemas.openxmlformats.org/officeDocument/2006/relationships" xmlns:v="urn:schemas-microsoft-com:vml" xmlns:w10="urn:schemas-microsoft-com:office:word" xmlns:w14="http://schemas.microsoft.com/office/word/2010/wordml" xmlns:w="http://schemas.openxmlformats.org/wordprocessingml/2006/main" xmlns:wne="http://schemas.microsoft.com/office/word/2006/wordml" xmlns:wp14="http://schemas.microsoft.com/office/word/2010/wordprocessingDrawing" xmlns:wp="http://schemas.openxmlformats.org/drawingml/2006/wordprocessingDrawing" xmlns:wpc="http://schemas.microsoft.com/office/word/2010/wordprocessingCanvas" xmlns:wpg="http://schemas.microsoft.com/office/word/2010/wordprocessingGroup" xmlns:wpi="http://schemas.microsoft.com/office/word/2010/wordprocessingInk" xmlns:wps="http://schemas.microsoft.com/office/word/2010/wordprocessingShape" mc:Ignorable="w14 wp14">
-  <w:p>
-    <w:pPr>
-      <w:pStyle w:val="Footer"/>
-      <w:jc w:val="center"/>
-    </w:pPr>
-    <w:r>
-      <w:rPr>
-        <w:rFonts w:ascii="Segoe UI" w:hAnsi="Segoe UI"/>
-        <w:color w:val="94A3B8"/>
-        <w:sz w:val="17"/>
-      </w:rPr>
-      <w:t>Jaipur Engineering College and Research Centre (JECRC), Jaipur • Department of CSE (AI)</w:t>
-    </w:r>
-  </w:p>
-</w:ftr>
-</file>
-
-<file path=word/header1.xml><?xml version="1.0" encoding="utf-8"?>
-<w:hdr xmlns:m="http://schemas.openxmlformats.org/officeDocument/2006/math" xmlns:mc="http://schemas.openxmlformats.org/markup-compatibility/2006" xmlns:mo="http://schemas.microsoft.com/office/mac/office/2008/main" xmlns:mv="urn:schemas-microsoft-com:mac:vml" xmlns:o="urn:schemas-microsoft-com:office:office" xmlns:r="http://schemas.openxmlformats.org/officeDocument/2006/relationships" xmlns:v="urn:schemas-microsoft-com:vml" xmlns:w10="urn:schemas-microsoft-com:office:word" xmlns:w14="http://schemas.microsoft.com/office/word/2010/wordml" xmlns:w="http://schemas.openxmlformats.org/wordprocessingml/2006/main" xmlns:wne="http://schemas.microsoft.com/office/word/2006/wordml" xmlns:wp14="http://schemas.microsoft.com/office/word/2010/wordprocessingDrawing" xmlns:wp="http://schemas.openxmlformats.org/drawingml/2006/wordprocessingDrawing" xmlns:wpc="http://schemas.microsoft.com/office/word/2010/wordprocessingCanvas" xmlns:wpg="http://schemas.microsoft.com/office/word/2010/wordprocessingGroup" xmlns:wpi="http://schemas.microsoft.com/office/word/2010/wordprocessingInk" xmlns:wps="http://schemas.microsoft.com/office/word/2010/wordprocessingShape" mc:Ignorable="w14 wp14">
-  <w:p>
-    <w:pPr>
-      <w:pStyle w:val="Header"/>
-      <w:jc w:val="right"/>
-    </w:pPr>
-    <w:r>
-      <w:rPr>
-        <w:rFonts w:ascii="Segoe UI" w:hAnsi="Segoe UI"/>
-        <w:color w:val="94A3B8"/>
-        <w:sz w:val="17"/>
-      </w:rPr>
-      <w:t>JECRC StaffNet | Project Report</w:t>
-    </w:r>
-  </w:p>
-</w:hdr>
 </file>
 
 <file path=word/numbering.xml><?xml version="1.0" encoding="utf-8"?>

</xml_diff>